<commit_message>
cut point range dataframe format update
</commit_message>
<xml_diff>
--- a/SportsReport.docx
+++ b/SportsReport.docx
@@ -841,7 +841,7 @@
                 <w:lang w:eastAsia="zh-CN"/>
                 <w14:ligatures w14:val="none"/>
               </w:rPr>
-              <w:t xml:space="preserve">2026-07-09</w:t>
+              <w:t xml:space="preserve">2026-07-10</w:t>
             </w:r>
           </w:p>
         </w:tc>
@@ -1046,7 +1046,7 @@
                 <w:lang w:eastAsia="zh-CN"/>
                 <w14:ligatures w14:val="none"/>
               </w:rPr>
-              <w:t xml:space="preserve">2026-07-09</w:t>
+              <w:t xml:space="preserve">2026-07-10</w:t>
             </w:r>
           </w:p>
         </w:tc>
@@ -1246,7 +1246,7 @@
                 <w:lang w:eastAsia="zh-CN"/>
                 <w14:ligatures w14:val="none"/>
               </w:rPr>
-              <w:t xml:space="preserve">2026-07-09</w:t>
+              <w:t xml:space="preserve">2026-07-10</w:t>
             </w:r>
           </w:p>
         </w:tc>

</xml_diff>

<commit_message>
Changes to Summary page
</commit_message>
<xml_diff>
--- a/SportsReport.docx
+++ b/SportsReport.docx
@@ -188,7 +188,7 @@
         <mc:AlternateContent>
           <mc:Choice Requires="wps">
             <w:drawing>
-              <wp:anchor distT="45720" distB="45720" distL="114300" distR="114300" simplePos="0" relativeHeight="251661312" behindDoc="0" locked="0" layoutInCell="1" allowOverlap="1" wp14:anchorId="66C97751" wp14:editId="792EDB06">
+              <wp:anchor distT="45720" distB="45720" distL="114300" distR="114300" simplePos="0" relativeHeight="251661312" behindDoc="0" locked="0" layoutInCell="1" allowOverlap="1" wp14:anchorId="66C97751" wp14:editId="1BB80EBA">
                 <wp:simplePos x="0" y="0"/>
                 <wp:positionH relativeFrom="column">
                   <wp:posOffset>876300</wp:posOffset>
@@ -196,8 +196,8 @@
                 <wp:positionV relativeFrom="paragraph">
                   <wp:posOffset>5715</wp:posOffset>
                 </wp:positionV>
-                <wp:extent cx="4981575" cy="381000"/>
-                <wp:effectExtent l="0" t="0" r="9525" b="0"/>
+                <wp:extent cx="4981575" cy="447675"/>
+                <wp:effectExtent l="0" t="0" r="9525" b="9525"/>
                 <wp:wrapSquare wrapText="bothSides"/>
                 <wp:docPr id="1003" name="Text Box 2"/>
                 <wp:cNvGraphicFramePr>
@@ -212,7 +212,7 @@
                       <wps:spPr bwMode="auto">
                         <a:xfrm>
                           <a:off x="0" y="0"/>
-                          <a:ext cx="4981575" cy="381000"/>
+                          <a:ext cx="4981575" cy="447675"/>
                         </a:xfrm>
                         <a:prstGeom prst="rect">
                           <a:avLst/>
@@ -233,7 +233,7 @@
                             <w:pPr>
                               <w:jc w:val="center"/>
                               <w:rPr>
-                                <w:rFonts w:ascii="Book Antiqua" w:hAnsi="Book Antiqua"/>
+                                <w:rFonts w:ascii="Comic Sans MS" w:hAnsi="Comic Sans MS"/>
                                 <w:b/>
                                 <w:bCs/>
                                 <w:sz w:val="36"/>
@@ -242,7 +242,7 @@
                             </w:pPr>
                             <w:r>
                               <w:rPr>
-                                <w:rFonts w:ascii="Book Antiqua" w:hAnsi="Book Antiqua"/>
+                                <w:rFonts w:ascii="Comic Sans MS" w:hAnsi="Comic Sans MS"/>
                                 <w:b/>
                                 <w:bCs/>
                                 <w:sz w:val="36"/>
@@ -274,14 +274,14 @@
                 <v:stroke joinstyle="miter"/>
                 <v:path gradientshapeok="t" o:connecttype="rect"/>
               </v:shapetype>
-              <v:shape id="Text Box 2" o:spid="_x0000_s1026" type="#_x0000_t202" style="position:absolute;margin-left:69pt;margin-top:.45pt;width:392.25pt;height:30pt;z-index:251661312;visibility:visible;mso-wrap-style:square;mso-width-percent:0;mso-height-percent:0;mso-wrap-distance-left:9pt;mso-wrap-distance-top:3.6pt;mso-wrap-distance-right:9pt;mso-wrap-distance-bottom:3.6pt;mso-position-horizontal:absolute;mso-position-horizontal-relative:text;mso-position-vertical:absolute;mso-position-vertical-relative:text;mso-width-percent:0;mso-height-percent:0;mso-width-relative:margin;mso-height-relative:margin;v-text-anchor:top" o:gfxdata="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" stroked="f">
+              <v:shape id="Text Box 2" o:spid="_x0000_s1026" type="#_x0000_t202" style="position:absolute;margin-left:69pt;margin-top:.45pt;width:392.25pt;height:35.25pt;z-index:251661312;visibility:visible;mso-wrap-style:square;mso-width-percent:0;mso-height-percent:0;mso-wrap-distance-left:9pt;mso-wrap-distance-top:3.6pt;mso-wrap-distance-right:9pt;mso-wrap-distance-bottom:3.6pt;mso-position-horizontal:absolute;mso-position-horizontal-relative:text;mso-position-vertical:absolute;mso-position-vertical-relative:text;mso-width-percent:0;mso-height-percent:0;mso-width-relative:margin;mso-height-relative:margin;v-text-anchor:top" o:gfxdata="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" stroked="f">
                 <v:textbox>
                   <w:txbxContent>
                     <w:p>
                       <w:pPr>
                         <w:jc w:val="center"/>
                         <w:rPr>
-                          <w:rFonts w:ascii="Book Antiqua" w:hAnsi="Book Antiqua"/>
+                          <w:rFonts w:ascii="Comic Sans MS" w:hAnsi="Comic Sans MS"/>
                           <w:b/>
                           <w:bCs/>
                           <w:sz w:val="36"/>
@@ -290,7 +290,7 @@
                       </w:pPr>
                       <w:r>
                         <w:rPr>
-                          <w:rFonts w:ascii="Book Antiqua" w:hAnsi="Book Antiqua"/>
+                          <w:rFonts w:ascii="Comic Sans MS" w:hAnsi="Comic Sans MS"/>
                           <w:b/>
                           <w:bCs/>
                           <w:sz w:val="36"/>
@@ -373,13 +373,21 @@
         <w:tblStyle w:val="TableGrid"/>
         <w:tblW w:w="0" w:type="auto"/>
         <w:jc w:val="center"/>
+        <w:tblBorders>
+          <w:top w:val="single" w:sz="12" w:space="0" w:color="auto"/>
+          <w:left w:val="single" w:sz="12" w:space="0" w:color="auto"/>
+          <w:bottom w:val="single" w:sz="12" w:space="0" w:color="auto"/>
+          <w:right w:val="single" w:sz="12" w:space="0" w:color="auto"/>
+          <w:insideH w:val="single" w:sz="12" w:space="0" w:color="auto"/>
+          <w:insideV w:val="single" w:sz="12" w:space="0" w:color="auto"/>
+        </w:tblBorders>
         <w:tblLook w:val="04A0" w:firstRow="1" w:lastRow="0" w:firstColumn="1" w:lastColumn="0" w:noHBand="0" w:noVBand="1"/>
       </w:tblPr>
       <w:tblGrid>
-        <w:gridCol w:w="2698"/>
-        <w:gridCol w:w="2698"/>
-        <w:gridCol w:w="2697"/>
-        <w:gridCol w:w="2697"/>
+        <w:gridCol w:w="2693"/>
+        <w:gridCol w:w="2695"/>
+        <w:gridCol w:w="2691"/>
+        <w:gridCol w:w="2691"/>
       </w:tblGrid>
       <w:tr>
         <w:trPr>
@@ -387,13 +395,14 @@
         </w:trPr>
         <w:tc>
           <w:tcPr>
-            <w:tcW w:w="10790" w:type="dxa"/>
+            <w:tcW w:w="10770" w:type="dxa"/>
             <w:gridSpan w:val="4"/>
             <w:shd w:val="clear" w:color="auto" w:fill="820A1E"/>
             <w:vAlign w:val="center"/>
           </w:tcPr>
           <w:p>
             <w:pPr>
+              <w:jc w:val="center"/>
               <w:rPr>
                 <w:rFonts w:ascii="Book Antiqua" w:eastAsia="Calibri" w:hAnsi="Book Antiqua" w:cs="Times New Roman"/>
                 <w:b/>
@@ -414,7 +423,19 @@
                 <w:lang w:eastAsia="zh-CN"/>
                 <w14:ligatures w14:val="none"/>
               </w:rPr>
-              <w:t>Patient Information</w:t>
+              <w:t>Subject</w:t>
+            </w:r>
+            <w:r>
+              <w:rPr>
+                <w:rFonts w:ascii="Book Antiqua" w:eastAsia="Calibri" w:hAnsi="Book Antiqua" w:cs="Times New Roman"/>
+                <w:b/>
+                <w:bCs/>
+                <w:kern w:val="0"/>
+                <w:szCs w:val="20"/>
+                <w:lang w:eastAsia="zh-CN"/>
+                <w14:ligatures w14:val="none"/>
+              </w:rPr>
+              <w:t xml:space="preserve"> Information</w:t>
             </w:r>
           </w:p>
         </w:tc>
@@ -425,7 +446,7 @@
         </w:trPr>
         <w:tc>
           <w:tcPr>
-            <w:tcW w:w="2698" w:type="dxa"/>
+            <w:tcW w:w="2693" w:type="dxa"/>
             <w:shd w:val="clear" w:color="auto" w:fill="820A1E"/>
             <w:vAlign w:val="center"/>
           </w:tcPr>
@@ -454,33 +475,53 @@
                 <w:lang w:eastAsia="zh-CN"/>
                 <w14:ligatures w14:val="none"/>
               </w:rPr>
-              <w:t>Nam</w:t>
+              <w:t>Name</w:t>
             </w:r>
+          </w:p>
+        </w:tc>
+        <w:tc>
+          <w:tcPr>
+            <w:tcW w:w="2695" w:type="dxa"/>
+            <w:vAlign w:val="center"/>
+          </w:tcPr>
+          <w:p>
+            <w:pPr>
+              <w:jc w:val="center"/>
+              <w:rPr>
+                <w:rFonts w:ascii="Book Antiqua" w:eastAsia="Calibri" w:hAnsi="Book Antiqua" w:cs="Times New Roman"/>
+                <w:kern w:val="0"/>
+                <w:sz w:val="20"/>
+                <w:szCs w:val="20"/>
+                <w:lang w:eastAsia="zh-CN"/>
+                <w14:ligatures w14:val="none"/>
+              </w:rPr>
+            </w:pPr>
             <w:r>
               <w:rPr>
                 <w:rFonts w:ascii="Book Antiqua" w:eastAsia="Calibri" w:hAnsi="Book Antiqua" w:cs="Times New Roman"/>
-                <w:b/>
-                <w:bCs/>
-                <w:kern w:val="0"/>
-                <w:sz w:val="20"/>
-                <w:szCs w:val="20"/>
-                <w:lang w:eastAsia="zh-CN"/>
-                <w14:ligatures w14:val="none"/>
-              </w:rPr>
-              <w:t>e</w:t>
+                <w:kern w:val="0"/>
+                <w:sz w:val="20"/>
+                <w:szCs w:val="20"/>
+                <w:lang w:eastAsia="zh-CN"/>
+                <w14:ligatures w14:val="none"/>
+              </w:rPr>
+              <w:t>Warshauer, Spencer</w:t>
             </w:r>
           </w:p>
         </w:tc>
         <w:tc>
           <w:tcPr>
-            <w:tcW w:w="2698" w:type="dxa"/>
-            <w:vAlign w:val="center"/>
-          </w:tcPr>
-          <w:p>
-            <w:pPr>
-              <w:jc w:val="center"/>
-              <w:rPr>
-                <w:rFonts w:ascii="Book Antiqua" w:eastAsia="Calibri" w:hAnsi="Book Antiqua" w:cs="Times New Roman"/>
+            <w:tcW w:w="2691" w:type="dxa"/>
+            <w:shd w:val="clear" w:color="auto" w:fill="820A1E"/>
+            <w:vAlign w:val="center"/>
+          </w:tcPr>
+          <w:p>
+            <w:pPr>
+              <w:jc w:val="center"/>
+              <w:rPr>
+                <w:rFonts w:ascii="Book Antiqua" w:eastAsia="Calibri" w:hAnsi="Book Antiqua" w:cs="Times New Roman"/>
+                <w:b/>
+                <w:bCs/>
                 <w:kern w:val="0"/>
                 <w:sz w:val="20"/>
                 <w:szCs w:val="20"/>
@@ -491,29 +532,28 @@
             <w:r>
               <w:rPr>
                 <w:rFonts w:ascii="Book Antiqua" w:eastAsia="Calibri" w:hAnsi="Book Antiqua" w:cs="Times New Roman"/>
-                <w:kern w:val="0"/>
-                <w:sz w:val="20"/>
-                <w:szCs w:val="20"/>
-                <w:lang w:eastAsia="zh-CN"/>
-                <w14:ligatures w14:val="none"/>
-              </w:rPr>
-              <w:t xml:space="preserve">Doe, Jane</w:t>
+                <w:b/>
+                <w:bCs/>
+                <w:kern w:val="0"/>
+                <w:sz w:val="20"/>
+                <w:szCs w:val="20"/>
+                <w:lang w:eastAsia="zh-CN"/>
+                <w14:ligatures w14:val="none"/>
+              </w:rPr>
+              <w:t>Visit Date</w:t>
             </w:r>
           </w:p>
         </w:tc>
         <w:tc>
           <w:tcPr>
-            <w:tcW w:w="2697" w:type="dxa"/>
-            <w:shd w:val="clear" w:color="auto" w:fill="820A1E"/>
-            <w:vAlign w:val="center"/>
-          </w:tcPr>
-          <w:p>
-            <w:pPr>
-              <w:jc w:val="center"/>
-              <w:rPr>
-                <w:rFonts w:ascii="Book Antiqua" w:eastAsia="Calibri" w:hAnsi="Book Antiqua" w:cs="Times New Roman"/>
-                <w:b/>
-                <w:bCs/>
+            <w:tcW w:w="2691" w:type="dxa"/>
+            <w:vAlign w:val="center"/>
+          </w:tcPr>
+          <w:p>
+            <w:pPr>
+              <w:jc w:val="center"/>
+              <w:rPr>
+                <w:rFonts w:ascii="Book Antiqua" w:eastAsia="Calibri" w:hAnsi="Book Antiqua" w:cs="Times New Roman"/>
                 <w:kern w:val="0"/>
                 <w:sz w:val="20"/>
                 <w:szCs w:val="20"/>
@@ -524,45 +564,13 @@
             <w:r>
               <w:rPr>
                 <w:rFonts w:ascii="Book Antiqua" w:eastAsia="Calibri" w:hAnsi="Book Antiqua" w:cs="Times New Roman"/>
-                <w:b/>
-                <w:bCs/>
-                <w:kern w:val="0"/>
-                <w:sz w:val="20"/>
-                <w:szCs w:val="20"/>
-                <w:lang w:eastAsia="zh-CN"/>
-                <w14:ligatures w14:val="none"/>
-              </w:rPr>
-              <w:t>Gender</w:t>
-            </w:r>
-          </w:p>
-        </w:tc>
-        <w:tc>
-          <w:tcPr>
-            <w:tcW w:w="2697" w:type="dxa"/>
-            <w:vAlign w:val="center"/>
-          </w:tcPr>
-          <w:p>
-            <w:pPr>
-              <w:jc w:val="center"/>
-              <w:rPr>
-                <w:rFonts w:ascii="Book Antiqua" w:eastAsia="Calibri" w:hAnsi="Book Antiqua" w:cs="Times New Roman"/>
-                <w:kern w:val="0"/>
-                <w:sz w:val="20"/>
-                <w:szCs w:val="20"/>
-                <w:lang w:eastAsia="zh-CN"/>
-                <w14:ligatures w14:val="none"/>
-              </w:rPr>
-            </w:pPr>
-            <w:r>
-              <w:rPr>
-                <w:rFonts w:ascii="Book Antiqua" w:eastAsia="Calibri" w:hAnsi="Book Antiqua" w:cs="Times New Roman"/>
-                <w:kern w:val="0"/>
-                <w:sz w:val="20"/>
-                <w:szCs w:val="20"/>
-                <w:lang w:eastAsia="zh-CN"/>
-                <w14:ligatures w14:val="none"/>
-              </w:rPr>
-              <w:t xml:space="preserve"/>
+                <w:kern w:val="0"/>
+                <w:sz w:val="20"/>
+                <w:szCs w:val="20"/>
+                <w:lang w:eastAsia="zh-CN"/>
+                <w14:ligatures w14:val="none"/>
+              </w:rPr>
+              <w:t>2026-07-15</w:t>
             </w:r>
           </w:p>
         </w:tc>
@@ -573,286 +581,7 @@
         </w:trPr>
         <w:tc>
           <w:tcPr>
-            <w:tcW w:w="2698" w:type="dxa"/>
-            <w:shd w:val="clear" w:color="auto" w:fill="820A1E"/>
-            <w:vAlign w:val="center"/>
-          </w:tcPr>
-          <w:p>
-            <w:pPr>
-              <w:jc w:val="center"/>
-              <w:rPr>
-                <w:rFonts w:ascii="Book Antiqua" w:eastAsia="Calibri" w:hAnsi="Book Antiqua" w:cs="Times New Roman"/>
-                <w:b/>
-                <w:bCs/>
-                <w:kern w:val="0"/>
-                <w:sz w:val="20"/>
-                <w:szCs w:val="20"/>
-                <w:lang w:eastAsia="zh-CN"/>
-                <w14:ligatures w14:val="none"/>
-              </w:rPr>
-            </w:pPr>
-            <w:r>
-              <w:rPr>
-                <w:rFonts w:ascii="Book Antiqua" w:eastAsia="Calibri" w:hAnsi="Book Antiqua" w:cs="Times New Roman"/>
-                <w:b/>
-                <w:bCs/>
-                <w:kern w:val="0"/>
-                <w:sz w:val="20"/>
-                <w:szCs w:val="20"/>
-                <w:lang w:eastAsia="zh-CN"/>
-                <w14:ligatures w14:val="none"/>
-              </w:rPr>
-              <w:t>MRN</w:t>
-            </w:r>
-          </w:p>
-        </w:tc>
-        <w:tc>
-          <w:tcPr>
-            <w:tcW w:w="2698" w:type="dxa"/>
-            <w:vAlign w:val="center"/>
-          </w:tcPr>
-          <w:p>
-            <w:pPr>
-              <w:jc w:val="center"/>
-              <w:rPr>
-                <w:rFonts w:ascii="Book Antiqua" w:eastAsia="Calibri" w:hAnsi="Book Antiqua" w:cs="Times New Roman"/>
-                <w:kern w:val="0"/>
-                <w:sz w:val="20"/>
-                <w:szCs w:val="20"/>
-                <w:lang w:eastAsia="zh-CN"/>
-                <w14:ligatures w14:val="none"/>
-              </w:rPr>
-            </w:pPr>
-            <w:r>
-              <w:rPr>
-                <w:rFonts w:ascii="Book Antiqua" w:eastAsia="Calibri" w:hAnsi="Book Antiqua" w:cs="Times New Roman"/>
-                <w:kern w:val="0"/>
-                <w:sz w:val="20"/>
-                <w:szCs w:val="20"/>
-                <w:lang w:eastAsia="zh-CN"/>
-                <w14:ligatures w14:val="none"/>
-              </w:rPr>
-              <w:t xml:space="preserve">123</w:t>
-            </w:r>
-          </w:p>
-        </w:tc>
-        <w:tc>
-          <w:tcPr>
-            <w:tcW w:w="2697" w:type="dxa"/>
-            <w:shd w:val="clear" w:color="auto" w:fill="820A1E"/>
-            <w:vAlign w:val="center"/>
-          </w:tcPr>
-          <w:p>
-            <w:pPr>
-              <w:jc w:val="center"/>
-              <w:rPr>
-                <w:rFonts w:ascii="Book Antiqua" w:eastAsia="Calibri" w:hAnsi="Book Antiqua" w:cs="Times New Roman"/>
-                <w:b/>
-                <w:bCs/>
-                <w:kern w:val="0"/>
-                <w:sz w:val="20"/>
-                <w:szCs w:val="20"/>
-                <w:lang w:eastAsia="zh-CN"/>
-                <w14:ligatures w14:val="none"/>
-              </w:rPr>
-            </w:pPr>
-            <w:r>
-              <w:rPr>
-                <w:rFonts w:ascii="Book Antiqua" w:eastAsia="Calibri" w:hAnsi="Book Antiqua" w:cs="Times New Roman"/>
-                <w:b/>
-                <w:bCs/>
-                <w:kern w:val="0"/>
-                <w:sz w:val="20"/>
-                <w:szCs w:val="20"/>
-                <w:lang w:eastAsia="zh-CN"/>
-                <w14:ligatures w14:val="none"/>
-              </w:rPr>
-              <w:t>Sex</w:t>
-            </w:r>
-          </w:p>
-        </w:tc>
-        <w:tc>
-          <w:tcPr>
-            <w:tcW w:w="2697" w:type="dxa"/>
-            <w:vAlign w:val="center"/>
-          </w:tcPr>
-          <w:p>
-            <w:pPr>
-              <w:jc w:val="center"/>
-              <w:rPr>
-                <w:rFonts w:ascii="Book Antiqua" w:eastAsia="Calibri" w:hAnsi="Book Antiqua" w:cs="Times New Roman"/>
-                <w:kern w:val="0"/>
-                <w:sz w:val="20"/>
-                <w:szCs w:val="20"/>
-                <w:lang w:eastAsia="zh-CN"/>
-                <w14:ligatures w14:val="none"/>
-              </w:rPr>
-            </w:pPr>
-            <w:r>
-              <w:rPr>
-                <w:rFonts w:ascii="Book Antiqua" w:eastAsia="Calibri" w:hAnsi="Book Antiqua" w:cs="Times New Roman"/>
-                <w:kern w:val="0"/>
-                <w:sz w:val="20"/>
-                <w:szCs w:val="20"/>
-                <w:lang w:eastAsia="zh-CN"/>
-                <w14:ligatures w14:val="none"/>
-              </w:rPr>
-              <w:t xml:space="preserve"/>
-            </w:r>
-          </w:p>
-        </w:tc>
-      </w:tr>
-      <w:tr>
-        <w:trPr>
-          <w:jc w:val="center"/>
-        </w:trPr>
-        <w:tc>
-          <w:tcPr>
-            <w:tcW w:w="2698" w:type="dxa"/>
-            <w:shd w:val="clear" w:color="auto" w:fill="820A1E"/>
-            <w:vAlign w:val="center"/>
-          </w:tcPr>
-          <w:p>
-            <w:pPr>
-              <w:jc w:val="center"/>
-              <w:rPr>
-                <w:rFonts w:ascii="Book Antiqua" w:eastAsia="Calibri" w:hAnsi="Book Antiqua" w:cs="Times New Roman"/>
-                <w:kern w:val="0"/>
-                <w:sz w:val="20"/>
-                <w:szCs w:val="20"/>
-                <w:lang w:eastAsia="zh-CN"/>
-                <w14:ligatures w14:val="none"/>
-              </w:rPr>
-            </w:pPr>
-            <w:r>
-              <w:rPr>
-                <w:rFonts w:ascii="Book Antiqua" w:eastAsia="Calibri" w:hAnsi="Book Antiqua" w:cs="Times New Roman"/>
-                <w:b/>
-                <w:bCs/>
-                <w:kern w:val="0"/>
-                <w:sz w:val="20"/>
-                <w:szCs w:val="20"/>
-                <w:lang w:eastAsia="zh-CN"/>
-                <w14:ligatures w14:val="none"/>
-              </w:rPr>
-              <w:t>Physicia</w:t>
-            </w:r>
-            <w:r>
-              <w:rPr>
-                <w:rFonts w:ascii="Book Antiqua" w:eastAsia="Calibri" w:hAnsi="Book Antiqua" w:cs="Times New Roman"/>
-                <w:kern w:val="0"/>
-                <w:sz w:val="20"/>
-                <w:szCs w:val="20"/>
-                <w:lang w:eastAsia="zh-CN"/>
-                <w14:ligatures w14:val="none"/>
-              </w:rPr>
-              <w:t>n</w:t>
-            </w:r>
-          </w:p>
-        </w:tc>
-        <w:tc>
-          <w:tcPr>
-            <w:tcW w:w="2698" w:type="dxa"/>
-            <w:vAlign w:val="center"/>
-          </w:tcPr>
-          <w:p>
-            <w:pPr>
-              <w:jc w:val="center"/>
-              <w:rPr>
-                <w:rFonts w:ascii="Book Antiqua" w:eastAsia="Calibri" w:hAnsi="Book Antiqua" w:cs="Times New Roman"/>
-                <w:kern w:val="0"/>
-                <w:sz w:val="20"/>
-                <w:szCs w:val="20"/>
-                <w:lang w:eastAsia="zh-CN"/>
-                <w14:ligatures w14:val="none"/>
-              </w:rPr>
-            </w:pPr>
-            <w:r>
-              <w:rPr>
-                <w:rFonts w:ascii="Book Antiqua" w:eastAsia="Calibri" w:hAnsi="Book Antiqua" w:cs="Times New Roman"/>
-                <w:kern w:val="0"/>
-                <w:sz w:val="20"/>
-                <w:szCs w:val="20"/>
-                <w:lang w:eastAsia="zh-CN"/>
-                <w14:ligatures w14:val="none"/>
-              </w:rPr>
-              <w:t xml:space="preserve">Dr. Smith</w:t>
-            </w:r>
-          </w:p>
-        </w:tc>
-        <w:tc>
-          <w:tcPr>
-            <w:tcW w:w="2697" w:type="dxa"/>
-            <w:shd w:val="clear" w:color="auto" w:fill="820A1E"/>
-            <w:vAlign w:val="center"/>
-          </w:tcPr>
-          <w:p>
-            <w:pPr>
-              <w:jc w:val="center"/>
-              <w:rPr>
-                <w:rFonts w:ascii="Book Antiqua" w:eastAsia="Calibri" w:hAnsi="Book Antiqua" w:cs="Times New Roman"/>
-                <w:b/>
-                <w:bCs/>
-                <w:kern w:val="0"/>
-                <w:sz w:val="20"/>
-                <w:szCs w:val="20"/>
-                <w:lang w:eastAsia="zh-CN"/>
-                <w14:ligatures w14:val="none"/>
-              </w:rPr>
-            </w:pPr>
-            <w:r>
-              <w:rPr>
-                <w:rFonts w:ascii="Book Antiqua" w:eastAsia="Calibri" w:hAnsi="Book Antiqua" w:cs="Times New Roman"/>
-                <w:b/>
-                <w:bCs/>
-                <w:kern w:val="0"/>
-                <w:sz w:val="20"/>
-                <w:szCs w:val="20"/>
-                <w:lang w:eastAsia="zh-CN"/>
-                <w14:ligatures w14:val="none"/>
-              </w:rPr>
-              <w:t>Visit Date</w:t>
-            </w:r>
-          </w:p>
-        </w:tc>
-        <w:tc>
-          <w:tcPr>
-            <w:tcW w:w="2697" w:type="dxa"/>
-            <w:vAlign w:val="center"/>
-          </w:tcPr>
-          <w:p>
-            <w:pPr>
-              <w:jc w:val="center"/>
-              <w:rPr>
-                <w:rFonts w:ascii="Book Antiqua" w:eastAsia="Calibri" w:hAnsi="Book Antiqua" w:cs="Times New Roman"/>
-                <w:kern w:val="0"/>
-                <w:sz w:val="20"/>
-                <w:szCs w:val="20"/>
-                <w:lang w:eastAsia="zh-CN"/>
-                <w14:ligatures w14:val="none"/>
-              </w:rPr>
-            </w:pPr>
-            <w:r>
-              <w:rPr>
-                <w:rFonts w:ascii="Book Antiqua" w:eastAsia="Calibri" w:hAnsi="Book Antiqua" w:cs="Times New Roman"/>
-                <w:kern w:val="0"/>
-                <w:sz w:val="20"/>
-                <w:szCs w:val="20"/>
-                <w:lang w:eastAsia="zh-CN"/>
-                <w14:ligatures w14:val="none"/>
-              </w:rPr>
-              <w:t xml:space="preserve">2026-07-10</w:t>
-            </w:r>
-          </w:p>
-        </w:tc>
-      </w:tr>
-      <w:tr>
-        <w:trPr>
-          <w:jc w:val="center"/>
-        </w:trPr>
-        <w:tc>
-          <w:tcPr>
-            <w:tcW w:w="2698" w:type="dxa"/>
+            <w:tcW w:w="2693" w:type="dxa"/>
             <w:shd w:val="clear" w:color="auto" w:fill="820A1E"/>
             <w:vAlign w:val="center"/>
           </w:tcPr>
@@ -887,7 +616,7 @@
         </w:tc>
         <w:tc>
           <w:tcPr>
-            <w:tcW w:w="2698" w:type="dxa"/>
+            <w:tcW w:w="2695" w:type="dxa"/>
             <w:vAlign w:val="center"/>
           </w:tcPr>
           <w:p>
@@ -911,218 +640,13 @@
                 <w:lang w:eastAsia="zh-CN"/>
                 <w14:ligatures w14:val="none"/>
               </w:rPr>
-              <w:t xml:space="preserve">Jane Therapist</w:t>
+              <w:t>Weiss, Jackie, DPT</w:t>
             </w:r>
           </w:p>
         </w:tc>
         <w:tc>
           <w:tcPr>
-            <w:tcW w:w="2697" w:type="dxa"/>
-            <w:shd w:val="clear" w:color="auto" w:fill="820A1E"/>
-            <w:vAlign w:val="center"/>
-          </w:tcPr>
-          <w:p>
-            <w:pPr>
-              <w:jc w:val="center"/>
-              <w:rPr>
-                <w:rFonts w:ascii="Book Antiqua" w:eastAsia="Calibri" w:hAnsi="Book Antiqua" w:cs="Times New Roman"/>
-                <w:b/>
-                <w:bCs/>
-                <w:kern w:val="0"/>
-                <w:sz w:val="20"/>
-                <w:szCs w:val="20"/>
-                <w:lang w:eastAsia="zh-CN"/>
-                <w14:ligatures w14:val="none"/>
-              </w:rPr>
-            </w:pPr>
-            <w:r>
-              <w:rPr>
-                <w:rFonts w:ascii="Book Antiqua" w:eastAsia="Calibri" w:hAnsi="Book Antiqua" w:cs="Times New Roman"/>
-                <w:b/>
-                <w:bCs/>
-                <w:kern w:val="0"/>
-                <w:sz w:val="20"/>
-                <w:szCs w:val="20"/>
-                <w:lang w:eastAsia="zh-CN"/>
-                <w14:ligatures w14:val="none"/>
-              </w:rPr>
-              <w:t>Diagnosis</w:t>
-            </w:r>
-          </w:p>
-        </w:tc>
-        <w:tc>
-          <w:tcPr>
-            <w:tcW w:w="2697" w:type="dxa"/>
-            <w:vAlign w:val="center"/>
-          </w:tcPr>
-          <w:p>
-            <w:pPr>
-              <w:jc w:val="center"/>
-              <w:rPr>
-                <w:rFonts w:ascii="Book Antiqua" w:eastAsia="Calibri" w:hAnsi="Book Antiqua" w:cs="Times New Roman"/>
-                <w:kern w:val="0"/>
-                <w:sz w:val="20"/>
-                <w:szCs w:val="20"/>
-                <w:lang w:eastAsia="zh-CN"/>
-                <w14:ligatures w14:val="none"/>
-              </w:rPr>
-            </w:pPr>
-            <w:r>
-              <w:rPr>
-                <w:rFonts w:ascii="Book Antiqua" w:eastAsia="Calibri" w:hAnsi="Book Antiqua" w:cs="Times New Roman"/>
-                <w:kern w:val="0"/>
-                <w:sz w:val="20"/>
-                <w:szCs w:val="20"/>
-                <w:lang w:eastAsia="zh-CN"/>
-                <w14:ligatures w14:val="none"/>
-              </w:rPr>
-              <w:t xml:space="preserve"/>
-            </w:r>
-          </w:p>
-        </w:tc>
-      </w:tr>
-      <w:tr>
-        <w:trPr>
-          <w:jc w:val="center"/>
-        </w:trPr>
-        <w:tc>
-          <w:tcPr>
-            <w:tcW w:w="2698" w:type="dxa"/>
-            <w:shd w:val="clear" w:color="auto" w:fill="820A1E"/>
-            <w:vAlign w:val="center"/>
-          </w:tcPr>
-          <w:p>
-            <w:pPr>
-              <w:jc w:val="center"/>
-              <w:rPr>
-                <w:rFonts w:ascii="Book Antiqua" w:eastAsia="Calibri" w:hAnsi="Book Antiqua" w:cs="Times New Roman"/>
-                <w:b/>
-                <w:bCs/>
-                <w:kern w:val="0"/>
-                <w:sz w:val="20"/>
-                <w:szCs w:val="20"/>
-                <w:lang w:eastAsia="zh-CN"/>
-                <w14:ligatures w14:val="none"/>
-              </w:rPr>
-            </w:pPr>
-            <w:r>
-              <w:rPr>
-                <w:rFonts w:ascii="Book Antiqua" w:eastAsia="Calibri" w:hAnsi="Book Antiqua" w:cs="Times New Roman"/>
-                <w:b/>
-                <w:bCs/>
-                <w:kern w:val="0"/>
-                <w:sz w:val="20"/>
-                <w:szCs w:val="20"/>
-                <w:lang w:eastAsia="zh-CN"/>
-                <w14:ligatures w14:val="none"/>
-              </w:rPr>
-              <w:t>Date of Birth</w:t>
-            </w:r>
-          </w:p>
-        </w:tc>
-        <w:tc>
-          <w:tcPr>
-            <w:tcW w:w="2698" w:type="dxa"/>
-            <w:vAlign w:val="center"/>
-          </w:tcPr>
-          <w:p>
-            <w:pPr>
-              <w:jc w:val="center"/>
-              <w:rPr>
-                <w:rFonts w:ascii="Book Antiqua" w:eastAsia="Calibri" w:hAnsi="Book Antiqua" w:cs="Times New Roman"/>
-                <w:kern w:val="0"/>
-                <w:sz w:val="20"/>
-                <w:szCs w:val="20"/>
-                <w:lang w:eastAsia="zh-CN"/>
-                <w14:ligatures w14:val="none"/>
-              </w:rPr>
-            </w:pPr>
-            <w:r>
-              <w:rPr>
-                <w:rFonts w:ascii="Book Antiqua" w:eastAsia="Calibri" w:hAnsi="Book Antiqua" w:cs="Times New Roman"/>
-                <w:kern w:val="0"/>
-                <w:sz w:val="20"/>
-                <w:szCs w:val="20"/>
-                <w:lang w:eastAsia="zh-CN"/>
-                <w14:ligatures w14:val="none"/>
-              </w:rPr>
-              <w:t xml:space="preserve">2026-07-10</w:t>
-            </w:r>
-          </w:p>
-        </w:tc>
-        <w:tc>
-          <w:tcPr>
-            <w:tcW w:w="2697" w:type="dxa"/>
-            <w:shd w:val="clear" w:color="auto" w:fill="820A1E"/>
-            <w:vAlign w:val="center"/>
-          </w:tcPr>
-          <w:p>
-            <w:pPr>
-              <w:jc w:val="center"/>
-              <w:rPr>
-                <w:rFonts w:ascii="Book Antiqua" w:eastAsia="Calibri" w:hAnsi="Book Antiqua" w:cs="Times New Roman"/>
-                <w:b/>
-                <w:bCs/>
-                <w:kern w:val="0"/>
-                <w:sz w:val="20"/>
-                <w:szCs w:val="20"/>
-                <w:lang w:eastAsia="zh-CN"/>
-                <w14:ligatures w14:val="none"/>
-              </w:rPr>
-            </w:pPr>
-            <w:r>
-              <w:rPr>
-                <w:rFonts w:ascii="Book Antiqua" w:eastAsia="Calibri" w:hAnsi="Book Antiqua" w:cs="Times New Roman"/>
-                <w:b/>
-                <w:bCs/>
-                <w:kern w:val="0"/>
-                <w:sz w:val="20"/>
-                <w:szCs w:val="20"/>
-                <w:lang w:eastAsia="zh-CN"/>
-                <w14:ligatures w14:val="none"/>
-              </w:rPr>
-              <w:t>Injury Date</w:t>
-            </w:r>
-          </w:p>
-        </w:tc>
-        <w:tc>
-          <w:tcPr>
-            <w:tcW w:w="2697" w:type="dxa"/>
-            <w:vAlign w:val="center"/>
-          </w:tcPr>
-          <w:p>
-            <w:pPr>
-              <w:jc w:val="center"/>
-              <w:rPr>
-                <w:rFonts w:ascii="Book Antiqua" w:eastAsia="Calibri" w:hAnsi="Book Antiqua" w:cs="Times New Roman"/>
-                <w:kern w:val="0"/>
-                <w:sz w:val="20"/>
-                <w:szCs w:val="20"/>
-                <w:lang w:eastAsia="zh-CN"/>
-                <w14:ligatures w14:val="none"/>
-              </w:rPr>
-            </w:pPr>
-            <w:r>
-              <w:rPr>
-                <w:rFonts w:ascii="Book Antiqua" w:eastAsia="Calibri" w:hAnsi="Book Antiqua" w:cs="Times New Roman"/>
-                <w:kern w:val="0"/>
-                <w:sz w:val="20"/>
-                <w:szCs w:val="20"/>
-                <w:lang w:eastAsia="zh-CN"/>
-                <w14:ligatures w14:val="none"/>
-              </w:rPr>
-              <w:t xml:space="preserve"/>
-            </w:r>
-          </w:p>
-        </w:tc>
-      </w:tr>
-      <w:tr>
-        <w:trPr>
-          <w:jc w:val="center"/>
-        </w:trPr>
-        <w:tc>
-          <w:tcPr>
-            <w:tcW w:w="2698" w:type="dxa"/>
+            <w:tcW w:w="2691" w:type="dxa"/>
             <w:shd w:val="clear" w:color="auto" w:fill="820A1E"/>
             <w:vAlign w:val="center"/>
           </w:tcPr>
@@ -1157,7 +681,7 @@
         </w:tc>
         <w:tc>
           <w:tcPr>
-            <w:tcW w:w="2698" w:type="dxa"/>
+            <w:tcW w:w="2691" w:type="dxa"/>
             <w:vAlign w:val="center"/>
           </w:tcPr>
           <w:p>
@@ -1181,72 +705,7 @@
                 <w:lang w:eastAsia="zh-CN"/>
                 <w14:ligatures w14:val="none"/>
               </w:rPr>
-              <w:t xml:space="preserve">0</w:t>
-            </w:r>
-          </w:p>
-        </w:tc>
-        <w:tc>
-          <w:tcPr>
-            <w:tcW w:w="2697" w:type="dxa"/>
-            <w:shd w:val="clear" w:color="auto" w:fill="820A1E"/>
-            <w:vAlign w:val="center"/>
-          </w:tcPr>
-          <w:p>
-            <w:pPr>
-              <w:jc w:val="center"/>
-              <w:rPr>
-                <w:rFonts w:ascii="Book Antiqua" w:eastAsia="Calibri" w:hAnsi="Book Antiqua" w:cs="Times New Roman"/>
-                <w:b/>
-                <w:bCs/>
-                <w:kern w:val="0"/>
-                <w:sz w:val="20"/>
-                <w:szCs w:val="20"/>
-                <w:lang w:eastAsia="zh-CN"/>
-                <w14:ligatures w14:val="none"/>
-              </w:rPr>
-            </w:pPr>
-            <w:r>
-              <w:rPr>
-                <w:rFonts w:ascii="Book Antiqua" w:eastAsia="Calibri" w:hAnsi="Book Antiqua" w:cs="Times New Roman"/>
-                <w:b/>
-                <w:bCs/>
-                <w:kern w:val="0"/>
-                <w:sz w:val="20"/>
-                <w:szCs w:val="20"/>
-                <w:lang w:eastAsia="zh-CN"/>
-                <w14:ligatures w14:val="none"/>
-              </w:rPr>
-              <w:t>Surgery Date</w:t>
-            </w:r>
-          </w:p>
-        </w:tc>
-        <w:tc>
-          <w:tcPr>
-            <w:tcW w:w="2697" w:type="dxa"/>
-            <w:vAlign w:val="center"/>
-          </w:tcPr>
-          <w:p>
-            <w:pPr>
-              <w:jc w:val="center"/>
-              <w:rPr>
-                <w:rFonts w:ascii="Book Antiqua" w:eastAsia="Calibri" w:hAnsi="Book Antiqua" w:cs="Times New Roman"/>
-                <w:kern w:val="0"/>
-                <w:sz w:val="20"/>
-                <w:szCs w:val="20"/>
-                <w:lang w:eastAsia="zh-CN"/>
-                <w14:ligatures w14:val="none"/>
-              </w:rPr>
-            </w:pPr>
-            <w:r>
-              <w:rPr>
-                <w:rFonts w:ascii="Book Antiqua" w:eastAsia="Calibri" w:hAnsi="Book Antiqua" w:cs="Times New Roman"/>
-                <w:kern w:val="0"/>
-                <w:sz w:val="20"/>
-                <w:szCs w:val="20"/>
-                <w:lang w:eastAsia="zh-CN"/>
-                <w14:ligatures w14:val="none"/>
-              </w:rPr>
-              <w:t xml:space="preserve">2026-07-10</w:t>
+              <w:t>34</w:t>
             </w:r>
           </w:p>
         </w:tc>
@@ -1269,13 +728,21 @@
         <w:tblStyle w:val="TableGrid"/>
         <w:tblW w:w="0" w:type="auto"/>
         <w:jc w:val="center"/>
+        <w:tblBorders>
+          <w:top w:val="single" w:sz="12" w:space="0" w:color="auto"/>
+          <w:left w:val="single" w:sz="12" w:space="0" w:color="auto"/>
+          <w:bottom w:val="single" w:sz="12" w:space="0" w:color="auto"/>
+          <w:right w:val="single" w:sz="12" w:space="0" w:color="auto"/>
+          <w:insideH w:val="single" w:sz="12" w:space="0" w:color="auto"/>
+          <w:insideV w:val="single" w:sz="12" w:space="0" w:color="auto"/>
+        </w:tblBorders>
         <w:tblLook w:val="04A0" w:firstRow="1" w:lastRow="0" w:firstColumn="1" w:lastColumn="0" w:noHBand="0" w:noVBand="1"/>
       </w:tblPr>
       <w:tblGrid>
-        <w:gridCol w:w="2697"/>
-        <w:gridCol w:w="2698"/>
-        <w:gridCol w:w="2697"/>
-        <w:gridCol w:w="2698"/>
+        <w:gridCol w:w="2692"/>
+        <w:gridCol w:w="2693"/>
+        <w:gridCol w:w="2692"/>
+        <w:gridCol w:w="2693"/>
       </w:tblGrid>
       <w:tr>
         <w:trPr>
@@ -1283,13 +750,14 @@
         </w:trPr>
         <w:tc>
           <w:tcPr>
-            <w:tcW w:w="10790" w:type="dxa"/>
+            <w:tcW w:w="10770" w:type="dxa"/>
             <w:gridSpan w:val="4"/>
             <w:shd w:val="clear" w:color="auto" w:fill="820A1E"/>
             <w:vAlign w:val="center"/>
           </w:tcPr>
           <w:p>
             <w:pPr>
+              <w:jc w:val="center"/>
               <w:rPr>
                 <w:rFonts w:ascii="Book Antiqua" w:eastAsia="Calibri" w:hAnsi="Book Antiqua" w:cs="Times New Roman"/>
                 <w:b/>
@@ -1310,7 +778,148 @@
                 <w:lang w:eastAsia="zh-CN"/>
                 <w14:ligatures w14:val="none"/>
               </w:rPr>
-              <w:t>Tasks Symmetry</w:t>
+              <w:t>Drop Jump</w:t>
+            </w:r>
+            <w:r>
+              <w:rPr>
+                <w:rFonts w:ascii="Book Antiqua" w:eastAsia="Calibri" w:hAnsi="Book Antiqua" w:cs="Times New Roman"/>
+                <w:b/>
+                <w:bCs/>
+                <w:kern w:val="0"/>
+                <w:szCs w:val="20"/>
+                <w:lang w:eastAsia="zh-CN"/>
+                <w14:ligatures w14:val="none"/>
+              </w:rPr>
+              <w:t xml:space="preserve"> Symmetry</w:t>
+            </w:r>
+          </w:p>
+        </w:tc>
+      </w:tr>
+      <w:tr>
+        <w:trPr>
+          <w:trHeight w:val="105"/>
+          <w:jc w:val="center"/>
+        </w:trPr>
+        <w:tc>
+          <w:tcPr>
+            <w:tcW w:w="2692" w:type="dxa"/>
+            <w:shd w:val="clear" w:color="auto" w:fill="820A1E"/>
+            <w:vAlign w:val="center"/>
+          </w:tcPr>
+          <w:p>
+            <w:pPr>
+              <w:jc w:val="center"/>
+              <w:rPr>
+                <w:rFonts w:ascii="Book Antiqua" w:eastAsia="Calibri" w:hAnsi="Book Antiqua" w:cs="Times New Roman"/>
+                <w:b/>
+                <w:bCs/>
+                <w:kern w:val="0"/>
+                <w:szCs w:val="20"/>
+                <w:lang w:eastAsia="zh-CN"/>
+                <w14:ligatures w14:val="none"/>
+              </w:rPr>
+            </w:pPr>
+          </w:p>
+        </w:tc>
+        <w:tc>
+          <w:tcPr>
+            <w:tcW w:w="2693" w:type="dxa"/>
+            <w:vAlign w:val="center"/>
+          </w:tcPr>
+          <w:p>
+            <w:pPr>
+              <w:jc w:val="center"/>
+              <w:rPr>
+                <w:rFonts w:ascii="Book Antiqua" w:eastAsia="Calibri" w:hAnsi="Book Antiqua" w:cs="Times New Roman"/>
+                <w:b/>
+                <w:bCs/>
+                <w:kern w:val="0"/>
+                <w:sz w:val="20"/>
+                <w:szCs w:val="20"/>
+                <w:lang w:eastAsia="zh-CN"/>
+                <w14:ligatures w14:val="none"/>
+              </w:rPr>
+            </w:pPr>
+            <w:r>
+              <w:rPr>
+                <w:rFonts w:ascii="Book Antiqua" w:eastAsia="Calibri" w:hAnsi="Book Antiqua" w:cs="Times New Roman"/>
+                <w:b/>
+                <w:bCs/>
+                <w:kern w:val="0"/>
+                <w:sz w:val="20"/>
+                <w:szCs w:val="20"/>
+                <w:lang w:eastAsia="zh-CN"/>
+                <w14:ligatures w14:val="none"/>
+              </w:rPr>
+              <w:t>Left</w:t>
+            </w:r>
+          </w:p>
+        </w:tc>
+        <w:tc>
+          <w:tcPr>
+            <w:tcW w:w="2692" w:type="dxa"/>
+            <w:vAlign w:val="center"/>
+          </w:tcPr>
+          <w:p>
+            <w:pPr>
+              <w:jc w:val="center"/>
+              <w:rPr>
+                <w:rFonts w:ascii="Book Antiqua" w:eastAsia="Calibri" w:hAnsi="Book Antiqua" w:cs="Times New Roman"/>
+                <w:b/>
+                <w:bCs/>
+                <w:kern w:val="0"/>
+                <w:sz w:val="20"/>
+                <w:szCs w:val="20"/>
+                <w:lang w:eastAsia="zh-CN"/>
+                <w14:ligatures w14:val="none"/>
+              </w:rPr>
+            </w:pPr>
+            <w:r>
+              <w:rPr>
+                <w:rFonts w:ascii="Book Antiqua" w:eastAsia="Calibri" w:hAnsi="Book Antiqua" w:cs="Times New Roman"/>
+                <w:b/>
+                <w:bCs/>
+                <w:kern w:val="0"/>
+                <w:sz w:val="20"/>
+                <w:szCs w:val="20"/>
+                <w:lang w:eastAsia="zh-CN"/>
+                <w14:ligatures w14:val="none"/>
+              </w:rPr>
+              <w:t>Right</w:t>
+            </w:r>
+          </w:p>
+        </w:tc>
+        <w:tc>
+          <w:tcPr>
+            <w:tcW w:w="2693" w:type="dxa"/>
+            <w:vAlign w:val="center"/>
+          </w:tcPr>
+          <w:p>
+            <w:pPr>
+              <w:jc w:val="center"/>
+              <w:rPr>
+                <w:rFonts w:ascii="Book Antiqua" w:eastAsia="Calibri" w:hAnsi="Book Antiqua" w:cs="Times New Roman"/>
+                <w:b/>
+                <w:bCs/>
+                <w:kern w:val="0"/>
+                <w:sz w:val="20"/>
+                <w:szCs w:val="20"/>
+                <w:lang w:eastAsia="zh-CN"/>
+                <w14:ligatures w14:val="none"/>
+              </w:rPr>
+            </w:pPr>
+            <w:r>
+              <w:rPr>
+                <w:rFonts w:ascii="Book Antiqua" w:eastAsia="Calibri" w:hAnsi="Book Antiqua" w:cs="Times New Roman"/>
+                <w:b/>
+                <w:bCs/>
+                <w:kern w:val="0"/>
+                <w:sz w:val="20"/>
+                <w:szCs w:val="20"/>
+                <w:lang w:eastAsia="zh-CN"/>
+                <w14:ligatures w14:val="none"/>
+              </w:rPr>
+              <w:t>Difference</w:t>
             </w:r>
           </w:p>
         </w:tc>
@@ -1321,7 +930,7 @@
         </w:trPr>
         <w:tc>
           <w:tcPr>
-            <w:tcW w:w="2697" w:type="dxa"/>
+            <w:tcW w:w="2692" w:type="dxa"/>
             <w:shd w:val="clear" w:color="auto" w:fill="820A1E"/>
             <w:vAlign w:val="center"/>
           </w:tcPr>
@@ -1333,26 +942,6 @@
                 <w:b/>
                 <w:bCs/>
                 <w:kern w:val="0"/>
-                <w:szCs w:val="20"/>
-                <w:lang w:eastAsia="zh-CN"/>
-                <w14:ligatures w14:val="none"/>
-              </w:rPr>
-            </w:pPr>
-          </w:p>
-        </w:tc>
-        <w:tc>
-          <w:tcPr>
-            <w:tcW w:w="2698" w:type="dxa"/>
-            <w:vAlign w:val="center"/>
-          </w:tcPr>
-          <w:p>
-            <w:pPr>
-              <w:jc w:val="center"/>
-              <w:rPr>
-                <w:rFonts w:ascii="Book Antiqua" w:eastAsia="Calibri" w:hAnsi="Book Antiqua" w:cs="Times New Roman"/>
-                <w:b/>
-                <w:bCs/>
-                <w:kern w:val="0"/>
                 <w:sz w:val="20"/>
                 <w:szCs w:val="20"/>
                 <w:lang w:eastAsia="zh-CN"/>
@@ -1370,22 +959,20 @@
                 <w:lang w:eastAsia="zh-CN"/>
                 <w14:ligatures w14:val="none"/>
               </w:rPr>
-              <w:t>Walk</w:t>
+              <w:t>Hip Adduction</w:t>
             </w:r>
           </w:p>
         </w:tc>
         <w:tc>
           <w:tcPr>
-            <w:tcW w:w="2697" w:type="dxa"/>
-            <w:vAlign w:val="center"/>
-          </w:tcPr>
-          <w:p>
-            <w:pPr>
-              <w:jc w:val="center"/>
-              <w:rPr>
-                <w:rFonts w:ascii="Book Antiqua" w:eastAsia="Calibri" w:hAnsi="Book Antiqua" w:cs="Times New Roman"/>
-                <w:b/>
-                <w:bCs/>
+            <w:tcW w:w="2693" w:type="dxa"/>
+            <w:vAlign w:val="center"/>
+          </w:tcPr>
+          <w:p>
+            <w:pPr>
+              <w:jc w:val="center"/>
+              <w:rPr>
+                <w:rFonts w:ascii="Book Antiqua" w:eastAsia="Calibri" w:hAnsi="Book Antiqua" w:cs="Times New Roman"/>
                 <w:kern w:val="0"/>
                 <w:sz w:val="20"/>
                 <w:szCs w:val="20"/>
@@ -1395,138 +982,25 @@
             </w:pPr>
             <w:r>
               <w:rPr>
-                <w:rFonts w:ascii="Book Antiqua" w:eastAsia="Calibri" w:hAnsi="Book Antiqua" w:cs="Times New Roman"/>
-                <w:b/>
-                <w:bCs/>
-                <w:kern w:val="0"/>
-                <w:sz w:val="20"/>
-                <w:szCs w:val="20"/>
-                <w:lang w:eastAsia="zh-CN"/>
-                <w14:ligatures w14:val="none"/>
-              </w:rPr>
-              <w:t>Drop Jump</w:t>
-            </w:r>
-          </w:p>
-        </w:tc>
-        <w:tc>
-          <w:tcPr>
-            <w:tcW w:w="2698" w:type="dxa"/>
-            <w:vAlign w:val="center"/>
-          </w:tcPr>
-          <w:p>
-            <w:pPr>
-              <w:jc w:val="center"/>
-              <w:rPr>
-                <w:rFonts w:ascii="Book Antiqua" w:eastAsia="Calibri" w:hAnsi="Book Antiqua" w:cs="Times New Roman"/>
-                <w:b/>
-                <w:bCs/>
-                <w:kern w:val="0"/>
-                <w:sz w:val="20"/>
-                <w:szCs w:val="20"/>
-                <w:lang w:eastAsia="zh-CN"/>
-                <w14:ligatures w14:val="none"/>
-              </w:rPr>
-            </w:pPr>
-            <w:r>
-              <w:rPr>
-                <w:rFonts w:ascii="Book Antiqua" w:eastAsia="Calibri" w:hAnsi="Book Antiqua" w:cs="Times New Roman"/>
-                <w:b/>
-                <w:bCs/>
-                <w:kern w:val="0"/>
-                <w:sz w:val="20"/>
-                <w:szCs w:val="20"/>
-                <w:lang w:eastAsia="zh-CN"/>
-                <w14:ligatures w14:val="none"/>
-              </w:rPr>
-              <w:t>Heel Touch</w:t>
-            </w:r>
-          </w:p>
-        </w:tc>
-      </w:tr>
-      <w:tr>
-        <w:trPr>
-          <w:jc w:val="center"/>
-        </w:trPr>
-        <w:tc>
-          <w:tcPr>
-            <w:tcW w:w="2697" w:type="dxa"/>
-            <w:shd w:val="clear" w:color="auto" w:fill="820A1E"/>
-            <w:vAlign w:val="center"/>
-          </w:tcPr>
-          <w:p>
-            <w:pPr>
-              <w:jc w:val="center"/>
-              <w:rPr>
-                <w:rFonts w:ascii="Book Antiqua" w:eastAsia="Calibri" w:hAnsi="Book Antiqua" w:cs="Times New Roman"/>
-                <w:b/>
-                <w:bCs/>
-                <w:kern w:val="0"/>
-                <w:sz w:val="20"/>
-                <w:szCs w:val="20"/>
-                <w:lang w:eastAsia="zh-CN"/>
-                <w14:ligatures w14:val="none"/>
-              </w:rPr>
-            </w:pPr>
-            <w:r>
-              <w:rPr>
-                <w:rFonts w:ascii="Book Antiqua" w:eastAsia="Calibri" w:hAnsi="Book Antiqua" w:cs="Times New Roman"/>
-                <w:b/>
-                <w:bCs/>
-                <w:kern w:val="0"/>
-                <w:sz w:val="20"/>
-                <w:szCs w:val="20"/>
-                <w:lang w:eastAsia="zh-CN"/>
-                <w14:ligatures w14:val="none"/>
-              </w:rPr>
-              <w:t>Knee Flexion</w:t>
-            </w:r>
-          </w:p>
-        </w:tc>
-        <w:tc>
-          <w:tcPr>
-            <w:tcW w:w="2698" w:type="dxa"/>
-            <w:vAlign w:val="center"/>
-          </w:tcPr>
-          <w:p>
-            <w:pPr>
-              <w:jc w:val="center"/>
-              <w:rPr>
-                <w:rFonts w:ascii="Book Antiqua" w:eastAsia="Calibri" w:hAnsi="Book Antiqua" w:cs="Times New Roman"/>
-                <w:kern w:val="0"/>
-                <w:sz w:val="20"/>
-                <w:szCs w:val="20"/>
-                <w:lang w:eastAsia="zh-CN"/>
-                <w14:ligatures w14:val="none"/>
-              </w:rPr>
-            </w:pPr>
-            <w:r>
-              <w:rPr>
-                <w:rFonts w:ascii="Book Antiqua" w:eastAsia="Calibri" w:hAnsi="Book Antiqua" w:cs="Times New Roman"/>
-                <w:kern w:val="0"/>
-                <w:sz w:val="20"/>
-                <w:szCs w:val="20"/>
-                <w:lang w:eastAsia="zh-CN"/>
-                <w14:ligatures w14:val="none"/>
-              </w:rPr>
-              <w:t xml:space="preserve"/>
-            </w:r>
-            <w:r>
+                <w:noProof/>
+              </w:rPr>
               <w:drawing>
-                <wp:inline xmlns:a="http://schemas.openxmlformats.org/drawingml/2006/main" xmlns:pic="http://schemas.openxmlformats.org/drawingml/2006/picture">
+                <wp:inline distT="0" distB="0" distL="0" distR="0" wp14:anchorId="2320D513" wp14:editId="3D9AF64C">
                   <wp:extent cx="180000" cy="186192"/>
+                  <wp:effectExtent l="0" t="0" r="0" b="0"/>
                   <wp:docPr id="1004" name="Picture 218"/>
                   <wp:cNvGraphicFramePr>
-                    <a:graphicFrameLocks noChangeAspect="1"/>
+                    <a:graphicFrameLocks xmlns:a="http://schemas.openxmlformats.org/drawingml/2006/main" noChangeAspect="1"/>
                   </wp:cNvGraphicFramePr>
-                  <a:graphic>
+                  <a:graphic xmlns:a="http://schemas.openxmlformats.org/drawingml/2006/main">
                     <a:graphicData uri="http://schemas.openxmlformats.org/drawingml/2006/picture">
-                      <pic:pic>
+                      <pic:pic xmlns:pic="http://schemas.openxmlformats.org/drawingml/2006/picture">
                         <pic:nvPicPr>
                           <pic:cNvPr id="0" name="img_red_x.png"/>
                           <pic:cNvPicPr/>
                         </pic:nvPicPr>
                         <pic:blipFill>
-                          <a:blip r:embed="rId8"/>
+                          <a:blip r:embed="rId6"/>
                           <a:stretch>
                             <a:fillRect/>
                           </a:stretch>
@@ -1536,7 +1010,9 @@
                             <a:off x="0" y="0"/>
                             <a:ext cx="180000" cy="186192"/>
                           </a:xfrm>
-                          <a:prstGeom prst="rect"/>
+                          <a:prstGeom prst="rect">
+                            <a:avLst/>
+                          </a:prstGeom>
                         </pic:spPr>
                       </pic:pic>
                     </a:graphicData>
@@ -1544,56 +1020,46 @@
                 </wp:inline>
               </w:drawing>
             </w:r>
+          </w:p>
+        </w:tc>
+        <w:tc>
+          <w:tcPr>
+            <w:tcW w:w="2692" w:type="dxa"/>
+            <w:vAlign w:val="center"/>
+          </w:tcPr>
+          <w:p>
+            <w:pPr>
+              <w:jc w:val="center"/>
+              <w:rPr>
+                <w:rFonts w:ascii="Book Antiqua" w:eastAsia="Calibri" w:hAnsi="Book Antiqua" w:cs="Times New Roman"/>
+                <w:kern w:val="0"/>
+                <w:sz w:val="20"/>
+                <w:szCs w:val="20"/>
+                <w:lang w:eastAsia="zh-CN"/>
+                <w14:ligatures w14:val="none"/>
+              </w:rPr>
+            </w:pPr>
             <w:r>
-              <w:t xml:space="preserve"/>
-            </w:r>
-          </w:p>
-        </w:tc>
-        <w:tc>
-          <w:tcPr>
-            <w:tcW w:w="2697" w:type="dxa"/>
-            <w:vAlign w:val="center"/>
-          </w:tcPr>
-          <w:p>
-            <w:pPr>
-              <w:jc w:val="center"/>
-              <w:rPr>
-                <w:rFonts w:ascii="Book Antiqua" w:eastAsia="Calibri" w:hAnsi="Book Antiqua" w:cs="Times New Roman"/>
-                <w:kern w:val="0"/>
-                <w:sz w:val="20"/>
-                <w:szCs w:val="20"/>
-                <w:lang w:eastAsia="zh-CN"/>
-                <w14:ligatures w14:val="none"/>
-              </w:rPr>
-            </w:pPr>
-            <w:r>
-              <w:rPr>
-                <w:rFonts w:ascii="Book Antiqua" w:eastAsia="Calibri" w:hAnsi="Book Antiqua" w:cs="Times New Roman"/>
-                <w:kern w:val="0"/>
-                <w:sz w:val="20"/>
-                <w:szCs w:val="20"/>
-                <w:lang w:eastAsia="zh-CN"/>
-                <w14:ligatures w14:val="none"/>
-              </w:rPr>
-              <w:t xml:space="preserve"/>
-            </w:r>
-            <w:r>
+              <w:rPr>
+                <w:noProof/>
+              </w:rPr>
               <w:drawing>
-                <wp:inline xmlns:a="http://schemas.openxmlformats.org/drawingml/2006/main" xmlns:pic="http://schemas.openxmlformats.org/drawingml/2006/picture">
+                <wp:inline distT="0" distB="0" distL="0" distR="0" wp14:anchorId="7CE78484" wp14:editId="58D3C406">
                   <wp:extent cx="180000" cy="180000"/>
+                  <wp:effectExtent l="0" t="0" r="0" b="0"/>
                   <wp:docPr id="1005" name="Picture 218"/>
                   <wp:cNvGraphicFramePr>
-                    <a:graphicFrameLocks noChangeAspect="1"/>
+                    <a:graphicFrameLocks xmlns:a="http://schemas.openxmlformats.org/drawingml/2006/main" noChangeAspect="1"/>
                   </wp:cNvGraphicFramePr>
-                  <a:graphic>
+                  <a:graphic xmlns:a="http://schemas.openxmlformats.org/drawingml/2006/main">
                     <a:graphicData uri="http://schemas.openxmlformats.org/drawingml/2006/picture">
-                      <pic:pic>
+                      <pic:pic xmlns:pic="http://schemas.openxmlformats.org/drawingml/2006/picture">
                         <pic:nvPicPr>
                           <pic:cNvPr id="0" name="img_green_check.png"/>
                           <pic:cNvPicPr/>
                         </pic:nvPicPr>
                         <pic:blipFill>
-                          <a:blip r:embed="rId9"/>
+                          <a:blip r:embed="rId7"/>
                           <a:stretch>
                             <a:fillRect/>
                           </a:stretch>
@@ -1603,7 +1069,9 @@
                             <a:off x="0" y="0"/>
                             <a:ext cx="180000" cy="180000"/>
                           </a:xfrm>
-                          <a:prstGeom prst="rect"/>
+                          <a:prstGeom prst="rect">
+                            <a:avLst/>
+                          </a:prstGeom>
                         </pic:spPr>
                       </pic:pic>
                     </a:graphicData>
@@ -1611,56 +1079,46 @@
                 </wp:inline>
               </w:drawing>
             </w:r>
+          </w:p>
+        </w:tc>
+        <w:tc>
+          <w:tcPr>
+            <w:tcW w:w="2693" w:type="dxa"/>
+            <w:vAlign w:val="center"/>
+          </w:tcPr>
+          <w:p>
+            <w:pPr>
+              <w:jc w:val="center"/>
+              <w:rPr>
+                <w:rFonts w:ascii="Book Antiqua" w:eastAsia="Calibri" w:hAnsi="Book Antiqua" w:cs="Times New Roman"/>
+                <w:kern w:val="0"/>
+                <w:sz w:val="20"/>
+                <w:szCs w:val="20"/>
+                <w:lang w:eastAsia="zh-CN"/>
+                <w14:ligatures w14:val="none"/>
+              </w:rPr>
+            </w:pPr>
             <w:r>
-              <w:t xml:space="preserve"/>
-            </w:r>
-          </w:p>
-        </w:tc>
-        <w:tc>
-          <w:tcPr>
-            <w:tcW w:w="2698" w:type="dxa"/>
-            <w:vAlign w:val="center"/>
-          </w:tcPr>
-          <w:p>
-            <w:pPr>
-              <w:jc w:val="center"/>
-              <w:rPr>
-                <w:rFonts w:ascii="Book Antiqua" w:eastAsia="Calibri" w:hAnsi="Book Antiqua" w:cs="Times New Roman"/>
-                <w:kern w:val="0"/>
-                <w:sz w:val="20"/>
-                <w:szCs w:val="20"/>
-                <w:lang w:eastAsia="zh-CN"/>
-                <w14:ligatures w14:val="none"/>
-              </w:rPr>
-            </w:pPr>
-            <w:r>
-              <w:rPr>
-                <w:rFonts w:ascii="Book Antiqua" w:eastAsia="Calibri" w:hAnsi="Book Antiqua" w:cs="Times New Roman"/>
-                <w:kern w:val="0"/>
-                <w:sz w:val="20"/>
-                <w:szCs w:val="20"/>
-                <w:lang w:eastAsia="zh-CN"/>
-                <w14:ligatures w14:val="none"/>
-              </w:rPr>
-              <w:t xml:space="preserve"/>
-            </w:r>
-            <w:r>
+              <w:rPr>
+                <w:noProof/>
+              </w:rPr>
               <w:drawing>
-                <wp:inline xmlns:a="http://schemas.openxmlformats.org/drawingml/2006/main" xmlns:pic="http://schemas.openxmlformats.org/drawingml/2006/picture">
+                <wp:inline distT="0" distB="0" distL="0" distR="0" wp14:anchorId="4F13EEA0" wp14:editId="4AB63ECD">
                   <wp:extent cx="180000" cy="180000"/>
+                  <wp:effectExtent l="0" t="0" r="0" b="0"/>
                   <wp:docPr id="1006" name="Picture 218"/>
                   <wp:cNvGraphicFramePr>
-                    <a:graphicFrameLocks noChangeAspect="1"/>
+                    <a:graphicFrameLocks xmlns:a="http://schemas.openxmlformats.org/drawingml/2006/main" noChangeAspect="1"/>
                   </wp:cNvGraphicFramePr>
-                  <a:graphic>
+                  <a:graphic xmlns:a="http://schemas.openxmlformats.org/drawingml/2006/main">
                     <a:graphicData uri="http://schemas.openxmlformats.org/drawingml/2006/picture">
-                      <pic:pic>
+                      <pic:pic xmlns:pic="http://schemas.openxmlformats.org/drawingml/2006/picture">
                         <pic:nvPicPr>
                           <pic:cNvPr id="0" name="img_green_check.png"/>
                           <pic:cNvPicPr/>
                         </pic:nvPicPr>
                         <pic:blipFill>
-                          <a:blip r:embed="rId9"/>
+                          <a:blip r:embed="rId7"/>
                           <a:stretch>
                             <a:fillRect/>
                           </a:stretch>
@@ -1670,7 +1128,9 @@
                             <a:off x="0" y="0"/>
                             <a:ext cx="180000" cy="180000"/>
                           </a:xfrm>
-                          <a:prstGeom prst="rect"/>
+                          <a:prstGeom prst="rect">
+                            <a:avLst/>
+                          </a:prstGeom>
                         </pic:spPr>
                       </pic:pic>
                     </a:graphicData>
@@ -1678,9 +1138,6 @@
                 </wp:inline>
               </w:drawing>
             </w:r>
-            <w:r>
-              <w:t xml:space="preserve"/>
-            </w:r>
           </w:p>
         </w:tc>
       </w:tr>
@@ -1690,7 +1147,7 @@
         </w:trPr>
         <w:tc>
           <w:tcPr>
-            <w:tcW w:w="2697" w:type="dxa"/>
+            <w:tcW w:w="2692" w:type="dxa"/>
             <w:shd w:val="clear" w:color="auto" w:fill="820A1E"/>
             <w:vAlign w:val="center"/>
           </w:tcPr>
@@ -1699,6 +1156,8 @@
               <w:jc w:val="center"/>
               <w:rPr>
                 <w:rFonts w:ascii="Book Antiqua" w:eastAsia="Calibri" w:hAnsi="Book Antiqua" w:cs="Times New Roman"/>
+                <w:b/>
+                <w:bCs/>
                 <w:kern w:val="0"/>
                 <w:sz w:val="20"/>
                 <w:szCs w:val="20"/>
@@ -1717,51 +1176,51 @@
                 <w:lang w:eastAsia="zh-CN"/>
                 <w14:ligatures w14:val="none"/>
               </w:rPr>
-              <w:t>Hip Flexion</w:t>
+              <w:t>Knee Valgus</w:t>
             </w:r>
           </w:p>
         </w:tc>
         <w:tc>
           <w:tcPr>
-            <w:tcW w:w="2698" w:type="dxa"/>
-            <w:vAlign w:val="center"/>
-          </w:tcPr>
-          <w:p>
-            <w:pPr>
-              <w:jc w:val="center"/>
-              <w:rPr>
-                <w:rFonts w:ascii="Book Antiqua" w:eastAsia="Calibri" w:hAnsi="Book Antiqua" w:cs="Times New Roman"/>
-                <w:kern w:val="0"/>
-                <w:sz w:val="20"/>
-                <w:szCs w:val="20"/>
-                <w:lang w:eastAsia="zh-CN"/>
-                <w14:ligatures w14:val="none"/>
-              </w:rPr>
-            </w:pPr>
-          </w:p>
-        </w:tc>
-        <w:tc>
-          <w:tcPr>
-            <w:tcW w:w="2697" w:type="dxa"/>
-            <w:vAlign w:val="center"/>
-          </w:tcPr>
-          <w:p>
-            <w:pPr>
-              <w:jc w:val="center"/>
-              <w:rPr>
-                <w:rFonts w:ascii="Book Antiqua" w:eastAsia="Calibri" w:hAnsi="Book Antiqua" w:cs="Times New Roman"/>
-                <w:kern w:val="0"/>
-                <w:sz w:val="20"/>
-                <w:szCs w:val="20"/>
-                <w:lang w:eastAsia="zh-CN"/>
-                <w14:ligatures w14:val="none"/>
-              </w:rPr>
-            </w:pPr>
-          </w:p>
-        </w:tc>
-        <w:tc>
-          <w:tcPr>
-            <w:tcW w:w="2698" w:type="dxa"/>
+            <w:tcW w:w="2693" w:type="dxa"/>
+            <w:vAlign w:val="center"/>
+          </w:tcPr>
+          <w:p>
+            <w:pPr>
+              <w:jc w:val="center"/>
+              <w:rPr>
+                <w:rFonts w:ascii="Book Antiqua" w:eastAsia="Calibri" w:hAnsi="Book Antiqua" w:cs="Times New Roman"/>
+                <w:kern w:val="0"/>
+                <w:sz w:val="20"/>
+                <w:szCs w:val="20"/>
+                <w:lang w:eastAsia="zh-CN"/>
+                <w14:ligatures w14:val="none"/>
+              </w:rPr>
+            </w:pPr>
+          </w:p>
+        </w:tc>
+        <w:tc>
+          <w:tcPr>
+            <w:tcW w:w="2692" w:type="dxa"/>
+            <w:vAlign w:val="center"/>
+          </w:tcPr>
+          <w:p>
+            <w:pPr>
+              <w:jc w:val="center"/>
+              <w:rPr>
+                <w:rFonts w:ascii="Book Antiqua" w:eastAsia="Calibri" w:hAnsi="Book Antiqua" w:cs="Times New Roman"/>
+                <w:kern w:val="0"/>
+                <w:sz w:val="20"/>
+                <w:szCs w:val="20"/>
+                <w:lang w:eastAsia="zh-CN"/>
+                <w14:ligatures w14:val="none"/>
+              </w:rPr>
+            </w:pPr>
+          </w:p>
+        </w:tc>
+        <w:tc>
+          <w:tcPr>
+            <w:tcW w:w="2693" w:type="dxa"/>
             <w:vAlign w:val="center"/>
           </w:tcPr>
           <w:p>
@@ -1785,7 +1244,7 @@
         </w:trPr>
         <w:tc>
           <w:tcPr>
-            <w:tcW w:w="2697" w:type="dxa"/>
+            <w:tcW w:w="2692" w:type="dxa"/>
             <w:shd w:val="clear" w:color="auto" w:fill="820A1E"/>
             <w:vAlign w:val="center"/>
           </w:tcPr>
@@ -1812,51 +1271,64 @@
                 <w:lang w:eastAsia="zh-CN"/>
                 <w14:ligatures w14:val="none"/>
               </w:rPr>
-              <w:t>Trunk Flexion</w:t>
+              <w:t>Knee</w:t>
             </w:r>
-          </w:p>
-        </w:tc>
-        <w:tc>
-          <w:tcPr>
-            <w:tcW w:w="2698" w:type="dxa"/>
-            <w:vAlign w:val="center"/>
-          </w:tcPr>
-          <w:p>
-            <w:pPr>
-              <w:jc w:val="center"/>
-              <w:rPr>
-                <w:rFonts w:ascii="Book Antiqua" w:eastAsia="Calibri" w:hAnsi="Book Antiqua" w:cs="Times New Roman"/>
-                <w:kern w:val="0"/>
-                <w:sz w:val="20"/>
-                <w:szCs w:val="20"/>
-                <w:lang w:eastAsia="zh-CN"/>
-                <w14:ligatures w14:val="none"/>
-              </w:rPr>
-            </w:pPr>
-          </w:p>
-        </w:tc>
-        <w:tc>
-          <w:tcPr>
-            <w:tcW w:w="2697" w:type="dxa"/>
-            <w:vAlign w:val="center"/>
-          </w:tcPr>
-          <w:p>
-            <w:pPr>
-              <w:jc w:val="center"/>
-              <w:rPr>
-                <w:rFonts w:ascii="Book Antiqua" w:eastAsia="Calibri" w:hAnsi="Book Antiqua" w:cs="Times New Roman"/>
-                <w:kern w:val="0"/>
-                <w:sz w:val="20"/>
-                <w:szCs w:val="20"/>
-                <w:lang w:eastAsia="zh-CN"/>
-                <w14:ligatures w14:val="none"/>
-              </w:rPr>
-            </w:pPr>
-          </w:p>
-        </w:tc>
-        <w:tc>
-          <w:tcPr>
-            <w:tcW w:w="2698" w:type="dxa"/>
+            <w:r>
+              <w:rPr>
+                <w:rFonts w:ascii="Book Antiqua" w:eastAsia="Calibri" w:hAnsi="Book Antiqua" w:cs="Times New Roman"/>
+                <w:b/>
+                <w:bCs/>
+                <w:kern w:val="0"/>
+                <w:sz w:val="20"/>
+                <w:szCs w:val="20"/>
+                <w:lang w:eastAsia="zh-CN"/>
+                <w14:ligatures w14:val="none"/>
+              </w:rPr>
+              <w:t xml:space="preserve"> Flexion</w:t>
+            </w:r>
+          </w:p>
+        </w:tc>
+        <w:tc>
+          <w:tcPr>
+            <w:tcW w:w="2693" w:type="dxa"/>
+            <w:vAlign w:val="center"/>
+          </w:tcPr>
+          <w:p>
+            <w:pPr>
+              <w:jc w:val="center"/>
+              <w:rPr>
+                <w:rFonts w:ascii="Book Antiqua" w:eastAsia="Calibri" w:hAnsi="Book Antiqua" w:cs="Times New Roman"/>
+                <w:kern w:val="0"/>
+                <w:sz w:val="20"/>
+                <w:szCs w:val="20"/>
+                <w:lang w:eastAsia="zh-CN"/>
+                <w14:ligatures w14:val="none"/>
+              </w:rPr>
+            </w:pPr>
+          </w:p>
+        </w:tc>
+        <w:tc>
+          <w:tcPr>
+            <w:tcW w:w="2692" w:type="dxa"/>
+            <w:vAlign w:val="center"/>
+          </w:tcPr>
+          <w:p>
+            <w:pPr>
+              <w:jc w:val="center"/>
+              <w:rPr>
+                <w:rFonts w:ascii="Book Antiqua" w:eastAsia="Calibri" w:hAnsi="Book Antiqua" w:cs="Times New Roman"/>
+                <w:kern w:val="0"/>
+                <w:sz w:val="20"/>
+                <w:szCs w:val="20"/>
+                <w:lang w:eastAsia="zh-CN"/>
+                <w14:ligatures w14:val="none"/>
+              </w:rPr>
+            </w:pPr>
+          </w:p>
+        </w:tc>
+        <w:tc>
+          <w:tcPr>
+            <w:tcW w:w="2693" w:type="dxa"/>
             <w:vAlign w:val="center"/>
           </w:tcPr>
           <w:p>
@@ -1880,7 +1352,7 @@
         </w:trPr>
         <w:tc>
           <w:tcPr>
-            <w:tcW w:w="2697" w:type="dxa"/>
+            <w:tcW w:w="2692" w:type="dxa"/>
             <w:shd w:val="clear" w:color="auto" w:fill="820A1E"/>
             <w:vAlign w:val="center"/>
           </w:tcPr>
@@ -1907,51 +1379,51 @@
                 <w:lang w:eastAsia="zh-CN"/>
                 <w14:ligatures w14:val="none"/>
               </w:rPr>
-              <w:t>Hip Ab/Adduction(?)</w:t>
+              <w:t>Hip Flexion</w:t>
             </w:r>
           </w:p>
         </w:tc>
         <w:tc>
           <w:tcPr>
-            <w:tcW w:w="2698" w:type="dxa"/>
-            <w:vAlign w:val="center"/>
-          </w:tcPr>
-          <w:p>
-            <w:pPr>
-              <w:jc w:val="center"/>
-              <w:rPr>
-                <w:rFonts w:ascii="Book Antiqua" w:eastAsia="Calibri" w:hAnsi="Book Antiqua" w:cs="Times New Roman"/>
-                <w:kern w:val="0"/>
-                <w:sz w:val="20"/>
-                <w:szCs w:val="20"/>
-                <w:lang w:eastAsia="zh-CN"/>
-                <w14:ligatures w14:val="none"/>
-              </w:rPr>
-            </w:pPr>
-          </w:p>
-        </w:tc>
-        <w:tc>
-          <w:tcPr>
-            <w:tcW w:w="2697" w:type="dxa"/>
-            <w:vAlign w:val="center"/>
-          </w:tcPr>
-          <w:p>
-            <w:pPr>
-              <w:jc w:val="center"/>
-              <w:rPr>
-                <w:rFonts w:ascii="Book Antiqua" w:eastAsia="Calibri" w:hAnsi="Book Antiqua" w:cs="Times New Roman"/>
-                <w:kern w:val="0"/>
-                <w:sz w:val="20"/>
-                <w:szCs w:val="20"/>
-                <w:lang w:eastAsia="zh-CN"/>
-                <w14:ligatures w14:val="none"/>
-              </w:rPr>
-            </w:pPr>
-          </w:p>
-        </w:tc>
-        <w:tc>
-          <w:tcPr>
-            <w:tcW w:w="2698" w:type="dxa"/>
+            <w:tcW w:w="2693" w:type="dxa"/>
+            <w:vAlign w:val="center"/>
+          </w:tcPr>
+          <w:p>
+            <w:pPr>
+              <w:jc w:val="center"/>
+              <w:rPr>
+                <w:rFonts w:ascii="Book Antiqua" w:eastAsia="Calibri" w:hAnsi="Book Antiqua" w:cs="Times New Roman"/>
+                <w:kern w:val="0"/>
+                <w:sz w:val="20"/>
+                <w:szCs w:val="20"/>
+                <w:lang w:eastAsia="zh-CN"/>
+                <w14:ligatures w14:val="none"/>
+              </w:rPr>
+            </w:pPr>
+          </w:p>
+        </w:tc>
+        <w:tc>
+          <w:tcPr>
+            <w:tcW w:w="2692" w:type="dxa"/>
+            <w:vAlign w:val="center"/>
+          </w:tcPr>
+          <w:p>
+            <w:pPr>
+              <w:jc w:val="center"/>
+              <w:rPr>
+                <w:rFonts w:ascii="Book Antiqua" w:eastAsia="Calibri" w:hAnsi="Book Antiqua" w:cs="Times New Roman"/>
+                <w:kern w:val="0"/>
+                <w:sz w:val="20"/>
+                <w:szCs w:val="20"/>
+                <w:lang w:eastAsia="zh-CN"/>
+                <w14:ligatures w14:val="none"/>
+              </w:rPr>
+            </w:pPr>
+          </w:p>
+        </w:tc>
+        <w:tc>
+          <w:tcPr>
+            <w:tcW w:w="2693" w:type="dxa"/>
             <w:vAlign w:val="center"/>
           </w:tcPr>
           <w:p>
@@ -1975,7 +1447,7 @@
         </w:trPr>
         <w:tc>
           <w:tcPr>
-            <w:tcW w:w="2697" w:type="dxa"/>
+            <w:tcW w:w="2692" w:type="dxa"/>
             <w:shd w:val="clear" w:color="auto" w:fill="820A1E"/>
             <w:vAlign w:val="center"/>
           </w:tcPr>
@@ -1984,6 +1456,8 @@
               <w:jc w:val="center"/>
               <w:rPr>
                 <w:rFonts w:ascii="Book Antiqua" w:eastAsia="Calibri" w:hAnsi="Book Antiqua" w:cs="Times New Roman"/>
+                <w:b/>
+                <w:bCs/>
                 <w:kern w:val="0"/>
                 <w:sz w:val="20"/>
                 <w:szCs w:val="20"/>
@@ -1994,139 +1468,59 @@
             <w:r>
               <w:rPr>
                 <w:rFonts w:ascii="Book Antiqua" w:eastAsia="Calibri" w:hAnsi="Book Antiqua" w:cs="Times New Roman"/>
-                <w:kern w:val="0"/>
-                <w:sz w:val="20"/>
-                <w:szCs w:val="20"/>
-                <w:lang w:eastAsia="zh-CN"/>
-                <w14:ligatures w14:val="none"/>
-              </w:rPr>
-              <w:t>Knee Varus/Valgus (?)</w:t>
+                <w:b/>
+                <w:bCs/>
+                <w:kern w:val="0"/>
+                <w:sz w:val="20"/>
+                <w:szCs w:val="20"/>
+                <w:lang w:eastAsia="zh-CN"/>
+                <w14:ligatures w14:val="none"/>
+              </w:rPr>
+              <w:t>Trunk Flexion</w:t>
             </w:r>
           </w:p>
         </w:tc>
         <w:tc>
           <w:tcPr>
-            <w:tcW w:w="2698" w:type="dxa"/>
-            <w:vAlign w:val="center"/>
-          </w:tcPr>
-          <w:p>
-            <w:pPr>
-              <w:jc w:val="center"/>
-              <w:rPr>
-                <w:rFonts w:ascii="Book Antiqua" w:eastAsia="Calibri" w:hAnsi="Book Antiqua" w:cs="Times New Roman"/>
-                <w:kern w:val="0"/>
-                <w:sz w:val="20"/>
-                <w:szCs w:val="20"/>
-                <w:lang w:eastAsia="zh-CN"/>
-                <w14:ligatures w14:val="none"/>
-              </w:rPr>
-            </w:pPr>
-          </w:p>
-        </w:tc>
-        <w:tc>
-          <w:tcPr>
-            <w:tcW w:w="2697" w:type="dxa"/>
-            <w:vAlign w:val="center"/>
-          </w:tcPr>
-          <w:p>
-            <w:pPr>
-              <w:jc w:val="center"/>
-              <w:rPr>
-                <w:rFonts w:ascii="Book Antiqua" w:eastAsia="Calibri" w:hAnsi="Book Antiqua" w:cs="Times New Roman"/>
-                <w:kern w:val="0"/>
-                <w:sz w:val="20"/>
-                <w:szCs w:val="20"/>
-                <w:lang w:eastAsia="zh-CN"/>
-                <w14:ligatures w14:val="none"/>
-              </w:rPr>
-            </w:pPr>
-          </w:p>
-        </w:tc>
-        <w:tc>
-          <w:tcPr>
-            <w:tcW w:w="2698" w:type="dxa"/>
-            <w:vAlign w:val="center"/>
-          </w:tcPr>
-          <w:p>
-            <w:pPr>
-              <w:jc w:val="center"/>
-              <w:rPr>
-                <w:rFonts w:ascii="Book Antiqua" w:eastAsia="Calibri" w:hAnsi="Book Antiqua" w:cs="Times New Roman"/>
-                <w:kern w:val="0"/>
-                <w:sz w:val="20"/>
-                <w:szCs w:val="20"/>
-                <w:lang w:eastAsia="zh-CN"/>
-                <w14:ligatures w14:val="none"/>
-              </w:rPr>
-            </w:pPr>
-          </w:p>
-        </w:tc>
-      </w:tr>
-      <w:tr>
-        <w:trPr>
-          <w:jc w:val="center"/>
-        </w:trPr>
-        <w:tc>
-          <w:tcPr>
-            <w:tcW w:w="2697" w:type="dxa"/>
-            <w:shd w:val="clear" w:color="auto" w:fill="820A1E"/>
-            <w:vAlign w:val="center"/>
-          </w:tcPr>
-          <w:p>
-            <w:pPr>
-              <w:jc w:val="center"/>
-              <w:rPr>
-                <w:rFonts w:ascii="Book Antiqua" w:eastAsia="Calibri" w:hAnsi="Book Antiqua" w:cs="Times New Roman"/>
-                <w:kern w:val="0"/>
-                <w:sz w:val="20"/>
-                <w:szCs w:val="20"/>
-                <w:lang w:eastAsia="zh-CN"/>
-                <w14:ligatures w14:val="none"/>
-              </w:rPr>
-            </w:pPr>
-          </w:p>
-        </w:tc>
-        <w:tc>
-          <w:tcPr>
-            <w:tcW w:w="2698" w:type="dxa"/>
-            <w:vAlign w:val="center"/>
-          </w:tcPr>
-          <w:p>
-            <w:pPr>
-              <w:jc w:val="center"/>
-              <w:rPr>
-                <w:rFonts w:ascii="Book Antiqua" w:eastAsia="Calibri" w:hAnsi="Book Antiqua" w:cs="Times New Roman"/>
-                <w:kern w:val="0"/>
-                <w:sz w:val="20"/>
-                <w:szCs w:val="20"/>
-                <w:lang w:eastAsia="zh-CN"/>
-                <w14:ligatures w14:val="none"/>
-              </w:rPr>
-            </w:pPr>
-          </w:p>
-        </w:tc>
-        <w:tc>
-          <w:tcPr>
-            <w:tcW w:w="2697" w:type="dxa"/>
-            <w:vAlign w:val="center"/>
-          </w:tcPr>
-          <w:p>
-            <w:pPr>
-              <w:jc w:val="center"/>
-              <w:rPr>
-                <w:rFonts w:ascii="Book Antiqua" w:eastAsia="Calibri" w:hAnsi="Book Antiqua" w:cs="Times New Roman"/>
-                <w:kern w:val="0"/>
-                <w:sz w:val="20"/>
-                <w:szCs w:val="20"/>
-                <w:lang w:eastAsia="zh-CN"/>
-                <w14:ligatures w14:val="none"/>
-              </w:rPr>
-            </w:pPr>
-          </w:p>
-        </w:tc>
-        <w:tc>
-          <w:tcPr>
-            <w:tcW w:w="2698" w:type="dxa"/>
+            <w:tcW w:w="2693" w:type="dxa"/>
+            <w:vAlign w:val="center"/>
+          </w:tcPr>
+          <w:p>
+            <w:pPr>
+              <w:jc w:val="center"/>
+              <w:rPr>
+                <w:rFonts w:ascii="Book Antiqua" w:eastAsia="Calibri" w:hAnsi="Book Antiqua" w:cs="Times New Roman"/>
+                <w:kern w:val="0"/>
+                <w:sz w:val="20"/>
+                <w:szCs w:val="20"/>
+                <w:lang w:eastAsia="zh-CN"/>
+                <w14:ligatures w14:val="none"/>
+              </w:rPr>
+            </w:pPr>
+          </w:p>
+        </w:tc>
+        <w:tc>
+          <w:tcPr>
+            <w:tcW w:w="2692" w:type="dxa"/>
+            <w:vAlign w:val="center"/>
+          </w:tcPr>
+          <w:p>
+            <w:pPr>
+              <w:jc w:val="center"/>
+              <w:rPr>
+                <w:rFonts w:ascii="Book Antiqua" w:eastAsia="Calibri" w:hAnsi="Book Antiqua" w:cs="Times New Roman"/>
+                <w:kern w:val="0"/>
+                <w:sz w:val="20"/>
+                <w:szCs w:val="20"/>
+                <w:lang w:eastAsia="zh-CN"/>
+                <w14:ligatures w14:val="none"/>
+              </w:rPr>
+            </w:pPr>
+          </w:p>
+        </w:tc>
+        <w:tc>
+          <w:tcPr>
+            <w:tcW w:w="2693" w:type="dxa"/>
             <w:vAlign w:val="center"/>
           </w:tcPr>
           <w:p>
@@ -2145,18 +1539,6 @@
         </w:tc>
       </w:tr>
     </w:tbl>
-    <w:p>
-      <w:pPr>
-        <w:spacing w:after="0" w:line="240" w:lineRule="auto"/>
-        <w:rPr>
-          <w:rFonts w:ascii="Times New Roman" w:eastAsia="Calibri" w:hAnsi="Times New Roman" w:cs="Times New Roman"/>
-          <w:kern w:val="0"/>
-          <w:szCs w:val="20"/>
-          <w:lang w:eastAsia="zh-CN"/>
-          <w14:ligatures w14:val="none"/>
-        </w:rPr>
-      </w:pPr>
-    </w:p>
     <w:p>
       <w:pPr>
         <w:spacing w:after="0" w:line="240" w:lineRule="auto"/>
@@ -2184,28 +1566,38 @@
     <w:tbl>
       <w:tblPr>
         <w:tblStyle w:val="TableGrid"/>
-        <w:tblpPr w:leftFromText="180" w:rightFromText="180" w:vertAnchor="text" w:horzAnchor="margin" w:tblpY="325"/>
         <w:tblW w:w="0" w:type="auto"/>
+        <w:jc w:val="center"/>
+        <w:tblBorders>
+          <w:top w:val="single" w:sz="12" w:space="0" w:color="auto"/>
+          <w:left w:val="single" w:sz="12" w:space="0" w:color="auto"/>
+          <w:bottom w:val="single" w:sz="12" w:space="0" w:color="auto"/>
+          <w:right w:val="single" w:sz="12" w:space="0" w:color="auto"/>
+          <w:insideH w:val="single" w:sz="12" w:space="0" w:color="auto"/>
+          <w:insideV w:val="single" w:sz="12" w:space="0" w:color="auto"/>
+        </w:tblBorders>
         <w:tblLook w:val="04A0" w:firstRow="1" w:lastRow="0" w:firstColumn="1" w:lastColumn="0" w:noHBand="0" w:noVBand="1"/>
       </w:tblPr>
       <w:tblGrid>
-        <w:gridCol w:w="1798"/>
-        <w:gridCol w:w="1798"/>
-        <w:gridCol w:w="1799"/>
-        <w:gridCol w:w="1798"/>
-        <w:gridCol w:w="1798"/>
-        <w:gridCol w:w="1799"/>
+        <w:gridCol w:w="2693"/>
+        <w:gridCol w:w="2692"/>
+        <w:gridCol w:w="2691"/>
+        <w:gridCol w:w="2694"/>
       </w:tblGrid>
       <w:tr>
+        <w:trPr>
+          <w:jc w:val="center"/>
+        </w:trPr>
         <w:tc>
           <w:tcPr>
             <w:tcW w:w="10790" w:type="dxa"/>
-            <w:gridSpan w:val="6"/>
+            <w:gridSpan w:val="4"/>
             <w:shd w:val="clear" w:color="auto" w:fill="820A1E"/>
             <w:vAlign w:val="center"/>
           </w:tcPr>
           <w:p>
             <w:pPr>
+              <w:jc w:val="center"/>
               <w:rPr>
                 <w:rFonts w:ascii="Book Antiqua" w:eastAsia="Calibri" w:hAnsi="Book Antiqua" w:cs="Times New Roman"/>
                 <w:b/>
@@ -2226,15 +1618,30 @@
                 <w:lang w:eastAsia="zh-CN"/>
                 <w14:ligatures w14:val="none"/>
               </w:rPr>
-              <w:t>Visit Summary</w:t>
+              <w:t>Heel Touch</w:t>
+            </w:r>
+            <w:r>
+              <w:rPr>
+                <w:rFonts w:ascii="Book Antiqua" w:eastAsia="Calibri" w:hAnsi="Book Antiqua" w:cs="Times New Roman"/>
+                <w:b/>
+                <w:bCs/>
+                <w:kern w:val="0"/>
+                <w:szCs w:val="20"/>
+                <w:lang w:eastAsia="zh-CN"/>
+                <w14:ligatures w14:val="none"/>
+              </w:rPr>
+              <w:t xml:space="preserve"> Symmetry</w:t>
             </w:r>
           </w:p>
         </w:tc>
       </w:tr>
       <w:tr>
-        <w:tc>
-          <w:tcPr>
-            <w:tcW w:w="1798" w:type="dxa"/>
+        <w:trPr>
+          <w:jc w:val="center"/>
+        </w:trPr>
+        <w:tc>
+          <w:tcPr>
+            <w:tcW w:w="2697" w:type="dxa"/>
             <w:shd w:val="clear" w:color="auto" w:fill="820A1E"/>
             <w:vAlign w:val="center"/>
           </w:tcPr>
@@ -2243,25 +1650,28 @@
               <w:jc w:val="center"/>
               <w:rPr>
                 <w:rFonts w:ascii="Book Antiqua" w:eastAsia="Calibri" w:hAnsi="Book Antiqua" w:cs="Times New Roman"/>
-                <w:kern w:val="0"/>
-                <w:sz w:val="20"/>
-                <w:szCs w:val="20"/>
-                <w:lang w:eastAsia="zh-CN"/>
-                <w14:ligatures w14:val="none"/>
-              </w:rPr>
-            </w:pPr>
-          </w:p>
-        </w:tc>
-        <w:tc>
-          <w:tcPr>
-            <w:tcW w:w="1798" w:type="dxa"/>
-            <w:vAlign w:val="center"/>
-          </w:tcPr>
-          <w:p>
-            <w:pPr>
-              <w:jc w:val="center"/>
-              <w:rPr>
-                <w:rFonts w:ascii="Book Antiqua" w:eastAsia="Calibri" w:hAnsi="Book Antiqua" w:cs="Times New Roman"/>
+                <w:b/>
+                <w:bCs/>
+                <w:kern w:val="0"/>
+                <w:szCs w:val="20"/>
+                <w:lang w:eastAsia="zh-CN"/>
+                <w14:ligatures w14:val="none"/>
+              </w:rPr>
+            </w:pPr>
+          </w:p>
+        </w:tc>
+        <w:tc>
+          <w:tcPr>
+            <w:tcW w:w="2698" w:type="dxa"/>
+            <w:vAlign w:val="center"/>
+          </w:tcPr>
+          <w:p>
+            <w:pPr>
+              <w:jc w:val="center"/>
+              <w:rPr>
+                <w:rFonts w:ascii="Book Antiqua" w:eastAsia="Calibri" w:hAnsi="Book Antiqua" w:cs="Times New Roman"/>
+                <w:b/>
+                <w:bCs/>
                 <w:kern w:val="0"/>
                 <w:sz w:val="20"/>
                 <w:szCs w:val="20"/>
@@ -2272,26 +1682,30 @@
             <w:r>
               <w:rPr>
                 <w:rFonts w:ascii="Book Antiqua" w:eastAsia="Calibri" w:hAnsi="Book Antiqua" w:cs="Times New Roman"/>
-                <w:kern w:val="0"/>
-                <w:sz w:val="20"/>
-                <w:szCs w:val="20"/>
-                <w:lang w:eastAsia="zh-CN"/>
-                <w14:ligatures w14:val="none"/>
-              </w:rPr>
-              <w:t>V1</w:t>
+                <w:b/>
+                <w:bCs/>
+                <w:kern w:val="0"/>
+                <w:sz w:val="20"/>
+                <w:szCs w:val="20"/>
+                <w:lang w:eastAsia="zh-CN"/>
+                <w14:ligatures w14:val="none"/>
+              </w:rPr>
+              <w:t>Left</w:t>
             </w:r>
           </w:p>
         </w:tc>
         <w:tc>
           <w:tcPr>
-            <w:tcW w:w="1799" w:type="dxa"/>
-            <w:vAlign w:val="center"/>
-          </w:tcPr>
-          <w:p>
-            <w:pPr>
-              <w:jc w:val="center"/>
-              <w:rPr>
-                <w:rFonts w:ascii="Book Antiqua" w:eastAsia="Calibri" w:hAnsi="Book Antiqua" w:cs="Times New Roman"/>
+            <w:tcW w:w="2697" w:type="dxa"/>
+            <w:vAlign w:val="center"/>
+          </w:tcPr>
+          <w:p>
+            <w:pPr>
+              <w:jc w:val="center"/>
+              <w:rPr>
+                <w:rFonts w:ascii="Book Antiqua" w:eastAsia="Calibri" w:hAnsi="Book Antiqua" w:cs="Times New Roman"/>
+                <w:b/>
+                <w:bCs/>
                 <w:kern w:val="0"/>
                 <w:sz w:val="20"/>
                 <w:szCs w:val="20"/>
@@ -2302,26 +1716,30 @@
             <w:r>
               <w:rPr>
                 <w:rFonts w:ascii="Book Antiqua" w:eastAsia="Calibri" w:hAnsi="Book Antiqua" w:cs="Times New Roman"/>
-                <w:kern w:val="0"/>
-                <w:sz w:val="20"/>
-                <w:szCs w:val="20"/>
-                <w:lang w:eastAsia="zh-CN"/>
-                <w14:ligatures w14:val="none"/>
-              </w:rPr>
-              <w:t>V2</w:t>
+                <w:b/>
+                <w:bCs/>
+                <w:kern w:val="0"/>
+                <w:sz w:val="20"/>
+                <w:szCs w:val="20"/>
+                <w:lang w:eastAsia="zh-CN"/>
+                <w14:ligatures w14:val="none"/>
+              </w:rPr>
+              <w:t>Right</w:t>
             </w:r>
           </w:p>
         </w:tc>
         <w:tc>
           <w:tcPr>
-            <w:tcW w:w="1798" w:type="dxa"/>
-            <w:vAlign w:val="center"/>
-          </w:tcPr>
-          <w:p>
-            <w:pPr>
-              <w:jc w:val="center"/>
-              <w:rPr>
-                <w:rFonts w:ascii="Book Antiqua" w:eastAsia="Calibri" w:hAnsi="Book Antiqua" w:cs="Times New Roman"/>
+            <w:tcW w:w="2698" w:type="dxa"/>
+            <w:vAlign w:val="center"/>
+          </w:tcPr>
+          <w:p>
+            <w:pPr>
+              <w:jc w:val="center"/>
+              <w:rPr>
+                <w:rFonts w:ascii="Book Antiqua" w:eastAsia="Calibri" w:hAnsi="Book Antiqua" w:cs="Times New Roman"/>
+                <w:b/>
+                <w:bCs/>
                 <w:kern w:val="0"/>
                 <w:sz w:val="20"/>
                 <w:szCs w:val="20"/>
@@ -2332,79 +1750,26 @@
             <w:r>
               <w:rPr>
                 <w:rFonts w:ascii="Book Antiqua" w:eastAsia="Calibri" w:hAnsi="Book Antiqua" w:cs="Times New Roman"/>
-                <w:kern w:val="0"/>
-                <w:sz w:val="20"/>
-                <w:szCs w:val="20"/>
-                <w:lang w:eastAsia="zh-CN"/>
-                <w14:ligatures w14:val="none"/>
-              </w:rPr>
-              <w:t>V3</w:t>
-            </w:r>
-          </w:p>
-        </w:tc>
-        <w:tc>
-          <w:tcPr>
-            <w:tcW w:w="1798" w:type="dxa"/>
-          </w:tcPr>
-          <w:p>
-            <w:pPr>
-              <w:jc w:val="center"/>
-              <w:rPr>
-                <w:rFonts w:ascii="Book Antiqua" w:eastAsia="Calibri" w:hAnsi="Book Antiqua" w:cs="Times New Roman"/>
-                <w:kern w:val="0"/>
-                <w:sz w:val="20"/>
-                <w:szCs w:val="20"/>
-                <w:lang w:eastAsia="zh-CN"/>
-                <w14:ligatures w14:val="none"/>
-              </w:rPr>
-            </w:pPr>
-            <w:r>
-              <w:rPr>
-                <w:rFonts w:ascii="Book Antiqua" w:eastAsia="Calibri" w:hAnsi="Book Antiqua" w:cs="Times New Roman"/>
-                <w:kern w:val="0"/>
-                <w:sz w:val="20"/>
-                <w:szCs w:val="20"/>
-                <w:lang w:eastAsia="zh-CN"/>
-                <w14:ligatures w14:val="none"/>
-              </w:rPr>
-              <w:t>V4</w:t>
-            </w:r>
-          </w:p>
-        </w:tc>
-        <w:tc>
-          <w:tcPr>
-            <w:tcW w:w="1799" w:type="dxa"/>
-          </w:tcPr>
-          <w:p>
-            <w:pPr>
-              <w:jc w:val="center"/>
-              <w:rPr>
-                <w:rFonts w:ascii="Book Antiqua" w:eastAsia="Calibri" w:hAnsi="Book Antiqua" w:cs="Times New Roman"/>
-                <w:kern w:val="0"/>
-                <w:sz w:val="20"/>
-                <w:szCs w:val="20"/>
-                <w:lang w:eastAsia="zh-CN"/>
-                <w14:ligatures w14:val="none"/>
-              </w:rPr>
-            </w:pPr>
-            <w:r>
-              <w:rPr>
-                <w:rFonts w:ascii="Book Antiqua" w:eastAsia="Calibri" w:hAnsi="Book Antiqua" w:cs="Times New Roman"/>
-                <w:kern w:val="0"/>
-                <w:sz w:val="20"/>
-                <w:szCs w:val="20"/>
-                <w:lang w:eastAsia="zh-CN"/>
-                <w14:ligatures w14:val="none"/>
-              </w:rPr>
-              <w:t>V5</w:t>
+                <w:b/>
+                <w:bCs/>
+                <w:kern w:val="0"/>
+                <w:sz w:val="20"/>
+                <w:szCs w:val="20"/>
+                <w:lang w:eastAsia="zh-CN"/>
+                <w14:ligatures w14:val="none"/>
+              </w:rPr>
+              <w:t>Difference</w:t>
             </w:r>
           </w:p>
         </w:tc>
       </w:tr>
       <w:tr>
-        <w:tc>
-          <w:tcPr>
-            <w:tcW w:w="1798" w:type="dxa"/>
+        <w:trPr>
+          <w:jc w:val="center"/>
+        </w:trPr>
+        <w:tc>
+          <w:tcPr>
+            <w:tcW w:w="2697" w:type="dxa"/>
             <w:shd w:val="clear" w:color="auto" w:fill="820A1E"/>
             <w:vAlign w:val="center"/>
           </w:tcPr>
@@ -2433,13 +1798,13 @@
                 <w:lang w:eastAsia="zh-CN"/>
                 <w14:ligatures w14:val="none"/>
               </w:rPr>
-              <w:t>Walk</w:t>
+              <w:t>Hip Adduction</w:t>
             </w:r>
           </w:p>
         </w:tc>
         <w:tc>
           <w:tcPr>
-            <w:tcW w:w="1798" w:type="dxa"/>
+            <w:tcW w:w="2698" w:type="dxa"/>
             <w:vAlign w:val="center"/>
           </w:tcPr>
           <w:p>
@@ -2456,20 +1821,49 @@
             </w:pPr>
             <w:r>
               <w:rPr>
-                <w:rFonts w:ascii="Book Antiqua" w:eastAsia="Calibri" w:hAnsi="Book Antiqua" w:cs="Times New Roman"/>
-                <w:kern w:val="0"/>
-                <w:sz w:val="20"/>
-                <w:szCs w:val="20"/>
-                <w:lang w:eastAsia="zh-CN"/>
-                <w14:ligatures w14:val="none"/>
-              </w:rPr>
-              <w:t xml:space="preserve"/>
+                <w:noProof/>
+              </w:rPr>
+              <w:drawing>
+                <wp:inline distT="0" distB="0" distL="0" distR="0" wp14:anchorId="4C940DAC" wp14:editId="66DD5919">
+                  <wp:extent cx="180000" cy="186192"/>
+                  <wp:effectExtent l="0" t="0" r="0" b="0"/>
+                  <wp:docPr id="1007" name="Picture 218"/>
+                  <wp:cNvGraphicFramePr>
+                    <a:graphicFrameLocks xmlns:a="http://schemas.openxmlformats.org/drawingml/2006/main" noChangeAspect="1"/>
+                  </wp:cNvGraphicFramePr>
+                  <a:graphic xmlns:a="http://schemas.openxmlformats.org/drawingml/2006/main">
+                    <a:graphicData uri="http://schemas.openxmlformats.org/drawingml/2006/picture">
+                      <pic:pic xmlns:pic="http://schemas.openxmlformats.org/drawingml/2006/picture">
+                        <pic:nvPicPr>
+                          <pic:cNvPr id="0" name="img_red_x.png"/>
+                          <pic:cNvPicPr/>
+                        </pic:nvPicPr>
+                        <pic:blipFill>
+                          <a:blip r:embed="rId6"/>
+                          <a:stretch>
+                            <a:fillRect/>
+                          </a:stretch>
+                        </pic:blipFill>
+                        <pic:spPr>
+                          <a:xfrm>
+                            <a:off x="0" y="0"/>
+                            <a:ext cx="180000" cy="186192"/>
+                          </a:xfrm>
+                          <a:prstGeom prst="rect">
+                            <a:avLst/>
+                          </a:prstGeom>
+                        </pic:spPr>
+                      </pic:pic>
+                    </a:graphicData>
+                  </a:graphic>
+                </wp:inline>
+              </w:drawing>
             </w:r>
           </w:p>
         </w:tc>
         <w:tc>
           <w:tcPr>
-            <w:tcW w:w="1799" w:type="dxa"/>
+            <w:tcW w:w="2697" w:type="dxa"/>
             <w:vAlign w:val="center"/>
           </w:tcPr>
           <w:p>
@@ -2486,20 +1880,49 @@
             </w:pPr>
             <w:r>
               <w:rPr>
-                <w:rFonts w:ascii="Book Antiqua" w:eastAsia="Calibri" w:hAnsi="Book Antiqua" w:cs="Times New Roman"/>
-                <w:kern w:val="0"/>
-                <w:sz w:val="20"/>
-                <w:szCs w:val="20"/>
-                <w:lang w:eastAsia="zh-CN"/>
-                <w14:ligatures w14:val="none"/>
-              </w:rPr>
-              <w:t xml:space="preserve"/>
+                <w:noProof/>
+              </w:rPr>
+              <w:drawing>
+                <wp:inline distT="0" distB="0" distL="0" distR="0" wp14:anchorId="54AFF736" wp14:editId="7DABB85E">
+                  <wp:extent cx="180000" cy="180000"/>
+                  <wp:effectExtent l="0" t="0" r="0" b="0"/>
+                  <wp:docPr id="1008" name="Picture 218"/>
+                  <wp:cNvGraphicFramePr>
+                    <a:graphicFrameLocks xmlns:a="http://schemas.openxmlformats.org/drawingml/2006/main" noChangeAspect="1"/>
+                  </wp:cNvGraphicFramePr>
+                  <a:graphic xmlns:a="http://schemas.openxmlformats.org/drawingml/2006/main">
+                    <a:graphicData uri="http://schemas.openxmlformats.org/drawingml/2006/picture">
+                      <pic:pic xmlns:pic="http://schemas.openxmlformats.org/drawingml/2006/picture">
+                        <pic:nvPicPr>
+                          <pic:cNvPr id="0" name="img_green_check.png"/>
+                          <pic:cNvPicPr/>
+                        </pic:nvPicPr>
+                        <pic:blipFill>
+                          <a:blip r:embed="rId7"/>
+                          <a:stretch>
+                            <a:fillRect/>
+                          </a:stretch>
+                        </pic:blipFill>
+                        <pic:spPr>
+                          <a:xfrm>
+                            <a:off x="0" y="0"/>
+                            <a:ext cx="180000" cy="180000"/>
+                          </a:xfrm>
+                          <a:prstGeom prst="rect">
+                            <a:avLst/>
+                          </a:prstGeom>
+                        </pic:spPr>
+                      </pic:pic>
+                    </a:graphicData>
+                  </a:graphic>
+                </wp:inline>
+              </w:drawing>
             </w:r>
           </w:p>
         </w:tc>
         <w:tc>
           <w:tcPr>
-            <w:tcW w:w="1798" w:type="dxa"/>
+            <w:tcW w:w="2698" w:type="dxa"/>
             <w:vAlign w:val="center"/>
           </w:tcPr>
           <w:p>
@@ -2516,82 +1939,54 @@
             </w:pPr>
             <w:r>
               <w:rPr>
-                <w:rFonts w:ascii="Book Antiqua" w:eastAsia="Calibri" w:hAnsi="Book Antiqua" w:cs="Times New Roman"/>
-                <w:kern w:val="0"/>
-                <w:sz w:val="20"/>
-                <w:szCs w:val="20"/>
-                <w:lang w:eastAsia="zh-CN"/>
-                <w14:ligatures w14:val="none"/>
-              </w:rPr>
-              <w:t xml:space="preserve"/>
-            </w:r>
-          </w:p>
-        </w:tc>
-        <w:tc>
-          <w:tcPr>
-            <w:tcW w:w="1798" w:type="dxa"/>
-            <w:vAlign w:val="center"/>
-          </w:tcPr>
-          <w:p>
-            <w:pPr>
-              <w:jc w:val="center"/>
-              <w:rPr>
-                <w:rFonts w:ascii="Book Antiqua" w:eastAsia="Calibri" w:hAnsi="Book Antiqua" w:cs="Times New Roman"/>
-                <w:kern w:val="0"/>
-                <w:sz w:val="20"/>
-                <w:szCs w:val="20"/>
-                <w:lang w:eastAsia="zh-CN"/>
-                <w14:ligatures w14:val="none"/>
-              </w:rPr>
-            </w:pPr>
-            <w:r>
-              <w:rPr>
-                <w:rFonts w:ascii="Book Antiqua" w:eastAsia="Calibri" w:hAnsi="Book Antiqua" w:cs="Times New Roman"/>
-                <w:kern w:val="0"/>
-                <w:sz w:val="20"/>
-                <w:szCs w:val="20"/>
-                <w:lang w:eastAsia="zh-CN"/>
-                <w14:ligatures w14:val="none"/>
-              </w:rPr>
-              <w:t xml:space="preserve"/>
-            </w:r>
-          </w:p>
-        </w:tc>
-        <w:tc>
-          <w:tcPr>
-            <w:tcW w:w="1799" w:type="dxa"/>
-            <w:vAlign w:val="center"/>
-          </w:tcPr>
-          <w:p>
-            <w:pPr>
-              <w:jc w:val="center"/>
-              <w:rPr>
-                <w:rFonts w:ascii="Book Antiqua" w:eastAsia="Calibri" w:hAnsi="Book Antiqua" w:cs="Times New Roman"/>
-                <w:kern w:val="0"/>
-                <w:sz w:val="20"/>
-                <w:szCs w:val="20"/>
-                <w:lang w:eastAsia="zh-CN"/>
-                <w14:ligatures w14:val="none"/>
-              </w:rPr>
-            </w:pPr>
-            <w:r>
-              <w:rPr>
-                <w:rFonts w:ascii="Book Antiqua" w:eastAsia="Calibri" w:hAnsi="Book Antiqua" w:cs="Times New Roman"/>
-                <w:kern w:val="0"/>
-                <w:sz w:val="20"/>
-                <w:szCs w:val="20"/>
-                <w:lang w:eastAsia="zh-CN"/>
-                <w14:ligatures w14:val="none"/>
-              </w:rPr>
-              <w:t xml:space="preserve"/>
+                <w:noProof/>
+              </w:rPr>
+              <w:drawing>
+                <wp:inline distT="0" distB="0" distL="0" distR="0" wp14:anchorId="3FCCE19D" wp14:editId="31F81A6E">
+                  <wp:extent cx="180000" cy="180000"/>
+                  <wp:effectExtent l="0" t="0" r="0" b="0"/>
+                  <wp:docPr id="1009" name="Picture 218"/>
+                  <wp:cNvGraphicFramePr>
+                    <a:graphicFrameLocks xmlns:a="http://schemas.openxmlformats.org/drawingml/2006/main" noChangeAspect="1"/>
+                  </wp:cNvGraphicFramePr>
+                  <a:graphic xmlns:a="http://schemas.openxmlformats.org/drawingml/2006/main">
+                    <a:graphicData uri="http://schemas.openxmlformats.org/drawingml/2006/picture">
+                      <pic:pic xmlns:pic="http://schemas.openxmlformats.org/drawingml/2006/picture">
+                        <pic:nvPicPr>
+                          <pic:cNvPr id="0" name="img_green_check.png"/>
+                          <pic:cNvPicPr/>
+                        </pic:nvPicPr>
+                        <pic:blipFill>
+                          <a:blip r:embed="rId7"/>
+                          <a:stretch>
+                            <a:fillRect/>
+                          </a:stretch>
+                        </pic:blipFill>
+                        <pic:spPr>
+                          <a:xfrm>
+                            <a:off x="0" y="0"/>
+                            <a:ext cx="180000" cy="180000"/>
+                          </a:xfrm>
+                          <a:prstGeom prst="rect">
+                            <a:avLst/>
+                          </a:prstGeom>
+                        </pic:spPr>
+                      </pic:pic>
+                    </a:graphicData>
+                  </a:graphic>
+                </wp:inline>
+              </w:drawing>
             </w:r>
           </w:p>
         </w:tc>
       </w:tr>
       <w:tr>
-        <w:tc>
-          <w:tcPr>
-            <w:tcW w:w="1798" w:type="dxa"/>
+        <w:trPr>
+          <w:jc w:val="center"/>
+        </w:trPr>
+        <w:tc>
+          <w:tcPr>
+            <w:tcW w:w="2697" w:type="dxa"/>
             <w:shd w:val="clear" w:color="auto" w:fill="820A1E"/>
             <w:vAlign w:val="center"/>
           </w:tcPr>
@@ -2600,8 +1995,6 @@
               <w:jc w:val="center"/>
               <w:rPr>
                 <w:rFonts w:ascii="Book Antiqua" w:eastAsia="Calibri" w:hAnsi="Book Antiqua" w:cs="Times New Roman"/>
-                <w:b/>
-                <w:bCs/>
                 <w:kern w:val="0"/>
                 <w:sz w:val="20"/>
                 <w:szCs w:val="20"/>
@@ -2620,88 +2013,52 @@
                 <w:lang w:eastAsia="zh-CN"/>
                 <w14:ligatures w14:val="none"/>
               </w:rPr>
-              <w:t>Drop Jump</w:t>
+              <w:t>Knee Valgus</w:t>
             </w:r>
           </w:p>
         </w:tc>
         <w:tc>
           <w:tcPr>
-            <w:tcW w:w="1798" w:type="dxa"/>
-            <w:vAlign w:val="center"/>
-          </w:tcPr>
-          <w:p>
-            <w:pPr>
-              <w:jc w:val="center"/>
-              <w:rPr>
-                <w:rFonts w:ascii="Book Antiqua" w:eastAsia="Calibri" w:hAnsi="Book Antiqua" w:cs="Times New Roman"/>
-                <w:kern w:val="0"/>
-                <w:sz w:val="20"/>
-                <w:szCs w:val="20"/>
-                <w:lang w:eastAsia="zh-CN"/>
-                <w14:ligatures w14:val="none"/>
-              </w:rPr>
-            </w:pPr>
-          </w:p>
-        </w:tc>
-        <w:tc>
-          <w:tcPr>
-            <w:tcW w:w="1799" w:type="dxa"/>
-            <w:vAlign w:val="center"/>
-          </w:tcPr>
-          <w:p>
-            <w:pPr>
-              <w:jc w:val="center"/>
-              <w:rPr>
-                <w:rFonts w:ascii="Book Antiqua" w:eastAsia="Calibri" w:hAnsi="Book Antiqua" w:cs="Times New Roman"/>
-                <w:kern w:val="0"/>
-                <w:sz w:val="20"/>
-                <w:szCs w:val="20"/>
-                <w:lang w:eastAsia="zh-CN"/>
-                <w14:ligatures w14:val="none"/>
-              </w:rPr>
-            </w:pPr>
-          </w:p>
-        </w:tc>
-        <w:tc>
-          <w:tcPr>
-            <w:tcW w:w="1798" w:type="dxa"/>
-            <w:vAlign w:val="center"/>
-          </w:tcPr>
-          <w:p>
-            <w:pPr>
-              <w:jc w:val="center"/>
-              <w:rPr>
-                <w:rFonts w:ascii="Book Antiqua" w:eastAsia="Calibri" w:hAnsi="Book Antiqua" w:cs="Times New Roman"/>
-                <w:kern w:val="0"/>
-                <w:sz w:val="20"/>
-                <w:szCs w:val="20"/>
-                <w:lang w:eastAsia="zh-CN"/>
-                <w14:ligatures w14:val="none"/>
-              </w:rPr>
-            </w:pPr>
-          </w:p>
-        </w:tc>
-        <w:tc>
-          <w:tcPr>
-            <w:tcW w:w="1798" w:type="dxa"/>
-          </w:tcPr>
-          <w:p>
-            <w:pPr>
-              <w:jc w:val="center"/>
-              <w:rPr>
-                <w:rFonts w:ascii="Book Antiqua" w:eastAsia="Calibri" w:hAnsi="Book Antiqua" w:cs="Times New Roman"/>
-                <w:kern w:val="0"/>
-                <w:sz w:val="20"/>
-                <w:szCs w:val="20"/>
-                <w:lang w:eastAsia="zh-CN"/>
-                <w14:ligatures w14:val="none"/>
-              </w:rPr>
-            </w:pPr>
-          </w:p>
-        </w:tc>
-        <w:tc>
-          <w:tcPr>
-            <w:tcW w:w="1799" w:type="dxa"/>
+            <w:tcW w:w="2698" w:type="dxa"/>
+            <w:vAlign w:val="center"/>
+          </w:tcPr>
+          <w:p>
+            <w:pPr>
+              <w:jc w:val="center"/>
+              <w:rPr>
+                <w:rFonts w:ascii="Book Antiqua" w:eastAsia="Calibri" w:hAnsi="Book Antiqua" w:cs="Times New Roman"/>
+                <w:kern w:val="0"/>
+                <w:sz w:val="20"/>
+                <w:szCs w:val="20"/>
+                <w:lang w:eastAsia="zh-CN"/>
+                <w14:ligatures w14:val="none"/>
+              </w:rPr>
+            </w:pPr>
+          </w:p>
+        </w:tc>
+        <w:tc>
+          <w:tcPr>
+            <w:tcW w:w="2697" w:type="dxa"/>
+            <w:vAlign w:val="center"/>
+          </w:tcPr>
+          <w:p>
+            <w:pPr>
+              <w:jc w:val="center"/>
+              <w:rPr>
+                <w:rFonts w:ascii="Book Antiqua" w:eastAsia="Calibri" w:hAnsi="Book Antiqua" w:cs="Times New Roman"/>
+                <w:kern w:val="0"/>
+                <w:sz w:val="20"/>
+                <w:szCs w:val="20"/>
+                <w:lang w:eastAsia="zh-CN"/>
+                <w14:ligatures w14:val="none"/>
+              </w:rPr>
+            </w:pPr>
+          </w:p>
+        </w:tc>
+        <w:tc>
+          <w:tcPr>
+            <w:tcW w:w="2698" w:type="dxa"/>
+            <w:vAlign w:val="center"/>
           </w:tcPr>
           <w:p>
             <w:pPr>
@@ -2719,9 +2076,12 @@
         </w:tc>
       </w:tr>
       <w:tr>
-        <w:tc>
-          <w:tcPr>
-            <w:tcW w:w="1798" w:type="dxa"/>
+        <w:trPr>
+          <w:jc w:val="center"/>
+        </w:trPr>
+        <w:tc>
+          <w:tcPr>
+            <w:tcW w:w="2697" w:type="dxa"/>
             <w:shd w:val="clear" w:color="auto" w:fill="820A1E"/>
             <w:vAlign w:val="center"/>
           </w:tcPr>
@@ -2730,8 +2090,6 @@
               <w:jc w:val="center"/>
               <w:rPr>
                 <w:rFonts w:ascii="Book Antiqua" w:eastAsia="Calibri" w:hAnsi="Book Antiqua" w:cs="Times New Roman"/>
-                <w:b/>
-                <w:bCs/>
                 <w:kern w:val="0"/>
                 <w:sz w:val="20"/>
                 <w:szCs w:val="20"/>
@@ -2750,88 +2108,162 @@
                 <w:lang w:eastAsia="zh-CN"/>
                 <w14:ligatures w14:val="none"/>
               </w:rPr>
-              <w:t>Heel Touch</w:t>
+              <w:t xml:space="preserve">Pelvic </w:t>
             </w:r>
-          </w:p>
-        </w:tc>
-        <w:tc>
-          <w:tcPr>
-            <w:tcW w:w="1798" w:type="dxa"/>
-            <w:vAlign w:val="center"/>
-          </w:tcPr>
-          <w:p>
-            <w:pPr>
-              <w:jc w:val="center"/>
-              <w:rPr>
-                <w:rFonts w:ascii="Book Antiqua" w:eastAsia="Calibri" w:hAnsi="Book Antiqua" w:cs="Times New Roman"/>
-                <w:kern w:val="0"/>
-                <w:sz w:val="20"/>
-                <w:szCs w:val="20"/>
-                <w:lang w:eastAsia="zh-CN"/>
-                <w14:ligatures w14:val="none"/>
-              </w:rPr>
-            </w:pPr>
-          </w:p>
-        </w:tc>
-        <w:tc>
-          <w:tcPr>
-            <w:tcW w:w="1799" w:type="dxa"/>
-            <w:vAlign w:val="center"/>
-          </w:tcPr>
-          <w:p>
-            <w:pPr>
-              <w:jc w:val="center"/>
-              <w:rPr>
-                <w:rFonts w:ascii="Book Antiqua" w:eastAsia="Calibri" w:hAnsi="Book Antiqua" w:cs="Times New Roman"/>
-                <w:kern w:val="0"/>
-                <w:sz w:val="20"/>
-                <w:szCs w:val="20"/>
-                <w:lang w:eastAsia="zh-CN"/>
-                <w14:ligatures w14:val="none"/>
-              </w:rPr>
-            </w:pPr>
-          </w:p>
-        </w:tc>
-        <w:tc>
-          <w:tcPr>
-            <w:tcW w:w="1798" w:type="dxa"/>
-            <w:vAlign w:val="center"/>
-          </w:tcPr>
-          <w:p>
-            <w:pPr>
-              <w:jc w:val="center"/>
-              <w:rPr>
-                <w:rFonts w:ascii="Book Antiqua" w:eastAsia="Calibri" w:hAnsi="Book Antiqua" w:cs="Times New Roman"/>
-                <w:kern w:val="0"/>
-                <w:sz w:val="20"/>
-                <w:szCs w:val="20"/>
-                <w:lang w:eastAsia="zh-CN"/>
-                <w14:ligatures w14:val="none"/>
-              </w:rPr>
-            </w:pPr>
-          </w:p>
-        </w:tc>
-        <w:tc>
-          <w:tcPr>
-            <w:tcW w:w="1798" w:type="dxa"/>
-          </w:tcPr>
-          <w:p>
-            <w:pPr>
-              <w:jc w:val="center"/>
-              <w:rPr>
-                <w:rFonts w:ascii="Book Antiqua" w:eastAsia="Calibri" w:hAnsi="Book Antiqua" w:cs="Times New Roman"/>
-                <w:kern w:val="0"/>
-                <w:sz w:val="20"/>
-                <w:szCs w:val="20"/>
-                <w:lang w:eastAsia="zh-CN"/>
-                <w14:ligatures w14:val="none"/>
-              </w:rPr>
-            </w:pPr>
-          </w:p>
-        </w:tc>
-        <w:tc>
-          <w:tcPr>
-            <w:tcW w:w="1799" w:type="dxa"/>
+            <w:r>
+              <w:rPr>
+                <w:rFonts w:ascii="Book Antiqua" w:eastAsia="Calibri" w:hAnsi="Book Antiqua" w:cs="Times New Roman"/>
+                <w:b/>
+                <w:bCs/>
+                <w:kern w:val="0"/>
+                <w:sz w:val="20"/>
+                <w:szCs w:val="20"/>
+                <w:lang w:eastAsia="zh-CN"/>
+                <w14:ligatures w14:val="none"/>
+              </w:rPr>
+              <w:t>Obliquity</w:t>
+            </w:r>
+          </w:p>
+        </w:tc>
+        <w:tc>
+          <w:tcPr>
+            <w:tcW w:w="2698" w:type="dxa"/>
+            <w:vAlign w:val="center"/>
+          </w:tcPr>
+          <w:p>
+            <w:pPr>
+              <w:jc w:val="center"/>
+              <w:rPr>
+                <w:rFonts w:ascii="Book Antiqua" w:eastAsia="Calibri" w:hAnsi="Book Antiqua" w:cs="Times New Roman"/>
+                <w:kern w:val="0"/>
+                <w:sz w:val="20"/>
+                <w:szCs w:val="20"/>
+                <w:lang w:eastAsia="zh-CN"/>
+                <w14:ligatures w14:val="none"/>
+              </w:rPr>
+            </w:pPr>
+          </w:p>
+        </w:tc>
+        <w:tc>
+          <w:tcPr>
+            <w:tcW w:w="2697" w:type="dxa"/>
+            <w:vAlign w:val="center"/>
+          </w:tcPr>
+          <w:p>
+            <w:pPr>
+              <w:jc w:val="center"/>
+              <w:rPr>
+                <w:rFonts w:ascii="Book Antiqua" w:eastAsia="Calibri" w:hAnsi="Book Antiqua" w:cs="Times New Roman"/>
+                <w:kern w:val="0"/>
+                <w:sz w:val="20"/>
+                <w:szCs w:val="20"/>
+                <w:lang w:eastAsia="zh-CN"/>
+                <w14:ligatures w14:val="none"/>
+              </w:rPr>
+            </w:pPr>
+          </w:p>
+        </w:tc>
+        <w:tc>
+          <w:tcPr>
+            <w:tcW w:w="2698" w:type="dxa"/>
+            <w:vAlign w:val="center"/>
+          </w:tcPr>
+          <w:p>
+            <w:pPr>
+              <w:jc w:val="center"/>
+              <w:rPr>
+                <w:rFonts w:ascii="Book Antiqua" w:eastAsia="Calibri" w:hAnsi="Book Antiqua" w:cs="Times New Roman"/>
+                <w:kern w:val="0"/>
+                <w:sz w:val="20"/>
+                <w:szCs w:val="20"/>
+                <w:lang w:eastAsia="zh-CN"/>
+                <w14:ligatures w14:val="none"/>
+              </w:rPr>
+            </w:pPr>
+          </w:p>
+        </w:tc>
+      </w:tr>
+      <w:tr>
+        <w:trPr>
+          <w:jc w:val="center"/>
+        </w:trPr>
+        <w:tc>
+          <w:tcPr>
+            <w:tcW w:w="2697" w:type="dxa"/>
+            <w:shd w:val="clear" w:color="auto" w:fill="820A1E"/>
+            <w:vAlign w:val="center"/>
+          </w:tcPr>
+          <w:p>
+            <w:pPr>
+              <w:jc w:val="center"/>
+              <w:rPr>
+                <w:rFonts w:ascii="Book Antiqua" w:eastAsia="Calibri" w:hAnsi="Book Antiqua" w:cs="Times New Roman"/>
+                <w:b/>
+                <w:bCs/>
+                <w:kern w:val="0"/>
+                <w:sz w:val="20"/>
+                <w:szCs w:val="20"/>
+                <w:lang w:eastAsia="zh-CN"/>
+                <w14:ligatures w14:val="none"/>
+              </w:rPr>
+            </w:pPr>
+            <w:r>
+              <w:rPr>
+                <w:rFonts w:ascii="Book Antiqua" w:eastAsia="Calibri" w:hAnsi="Book Antiqua" w:cs="Times New Roman"/>
+                <w:b/>
+                <w:bCs/>
+                <w:kern w:val="0"/>
+                <w:sz w:val="20"/>
+                <w:szCs w:val="20"/>
+                <w:lang w:eastAsia="zh-CN"/>
+                <w14:ligatures w14:val="none"/>
+              </w:rPr>
+              <w:t xml:space="preserve">Trunk Obliquity </w:t>
+            </w:r>
+          </w:p>
+        </w:tc>
+        <w:tc>
+          <w:tcPr>
+            <w:tcW w:w="2698" w:type="dxa"/>
+            <w:vAlign w:val="center"/>
+          </w:tcPr>
+          <w:p>
+            <w:pPr>
+              <w:jc w:val="center"/>
+              <w:rPr>
+                <w:rFonts w:ascii="Book Antiqua" w:eastAsia="Calibri" w:hAnsi="Book Antiqua" w:cs="Times New Roman"/>
+                <w:kern w:val="0"/>
+                <w:sz w:val="20"/>
+                <w:szCs w:val="20"/>
+                <w:lang w:eastAsia="zh-CN"/>
+                <w14:ligatures w14:val="none"/>
+              </w:rPr>
+            </w:pPr>
+          </w:p>
+        </w:tc>
+        <w:tc>
+          <w:tcPr>
+            <w:tcW w:w="2697" w:type="dxa"/>
+            <w:vAlign w:val="center"/>
+          </w:tcPr>
+          <w:p>
+            <w:pPr>
+              <w:jc w:val="center"/>
+              <w:rPr>
+                <w:rFonts w:ascii="Book Antiqua" w:eastAsia="Calibri" w:hAnsi="Book Antiqua" w:cs="Times New Roman"/>
+                <w:kern w:val="0"/>
+                <w:sz w:val="20"/>
+                <w:szCs w:val="20"/>
+                <w:lang w:eastAsia="zh-CN"/>
+                <w14:ligatures w14:val="none"/>
+              </w:rPr>
+            </w:pPr>
+          </w:p>
+        </w:tc>
+        <w:tc>
+          <w:tcPr>
+            <w:tcW w:w="2698" w:type="dxa"/>
+            <w:vAlign w:val="center"/>
           </w:tcPr>
           <w:p>
             <w:pPr>
@@ -2849,6 +2281,18 @@
         </w:tc>
       </w:tr>
     </w:tbl>
+    <w:p>
+      <w:pPr>
+        <w:spacing w:after="0" w:line="240" w:lineRule="auto"/>
+        <w:rPr>
+          <w:rFonts w:ascii="Times New Roman" w:eastAsia="Calibri" w:hAnsi="Times New Roman" w:cs="Times New Roman"/>
+          <w:kern w:val="0"/>
+          <w:szCs w:val="20"/>
+          <w:lang w:eastAsia="zh-CN"/>
+          <w14:ligatures w14:val="none"/>
+        </w:rPr>
+      </w:pPr>
+    </w:p>
     <w:p>
       <w:pPr>
         <w:spacing w:after="0" w:line="240" w:lineRule="auto"/>
@@ -2870,217 +2314,6 @@
         </w:rPr>
         <w:br/>
       </w:r>
-    </w:p>
-    <w:p>
-      <w:pPr>
-        <w:rPr>
-          <w:rFonts w:ascii="Times New Roman" w:eastAsia="Calibri" w:hAnsi="Times New Roman" w:cs="Times New Roman"/>
-          <w:kern w:val="0"/>
-          <w:szCs w:val="20"/>
-          <w:lang w:eastAsia="zh-CN"/>
-          <w14:ligatures w14:val="none"/>
-        </w:rPr>
-      </w:pPr>
-      <w:r>
-        <w:rPr>
-          <w:rFonts w:ascii="Times New Roman" w:eastAsia="Calibri" w:hAnsi="Times New Roman" w:cs="Times New Roman"/>
-          <w:kern w:val="0"/>
-          <w:szCs w:val="20"/>
-          <w:lang w:eastAsia="zh-CN"/>
-          <w14:ligatures w14:val="none"/>
-        </w:rPr>
-        <w:br w:type="page"/>
-      </w:r>
-    </w:p>
-    <w:p>
-      <w:pPr>
-        <w:spacing w:after="0" w:line="240" w:lineRule="auto"/>
-        <w:rPr>
-          <w:rFonts w:ascii="Book Antiqua" w:eastAsia="Calibri" w:hAnsi="Book Antiqua" w:cs="Times New Roman"/>
-          <w:b/>
-          <w:bCs/>
-          <w:kern w:val="0"/>
-          <w:sz w:val="28"/>
-          <w:szCs w:val="28"/>
-          <w:lang w:eastAsia="zh-CN"/>
-          <w14:ligatures w14:val="none"/>
-        </w:rPr>
-      </w:pPr>
-      <w:r>
-        <w:rPr>
-          <w:rFonts w:ascii="Book Antiqua" w:eastAsia="Calibri" w:hAnsi="Book Antiqua" w:cs="Times New Roman"/>
-          <w:b/>
-          <w:bCs/>
-          <w:kern w:val="0"/>
-          <w:sz w:val="28"/>
-          <w:szCs w:val="28"/>
-          <w:lang w:eastAsia="zh-CN"/>
-          <w14:ligatures w14:val="none"/>
-        </w:rPr>
-        <w:lastRenderedPageBreak/>
-        <w:t>After Visit Summary</w:t>
-      </w:r>
-    </w:p>
-    <w:p>
-      <w:pPr>
-        <w:spacing w:after="0" w:line="240" w:lineRule="auto"/>
-        <w:rPr>
-          <w:rFonts w:ascii="Book Antiqua" w:eastAsia="Calibri" w:hAnsi="Book Antiqua" w:cs="Times New Roman"/>
-          <w:kern w:val="0"/>
-          <w:sz w:val="20"/>
-          <w:szCs w:val="20"/>
-          <w:lang w:eastAsia="zh-CN"/>
-          <w14:ligatures w14:val="none"/>
-        </w:rPr>
-      </w:pPr>
-    </w:p>
-    <w:p>
-      <w:pPr>
-        <w:spacing w:after="0" w:line="240" w:lineRule="auto"/>
-        <w:rPr>
-          <w:rFonts w:ascii="Book Antiqua" w:eastAsia="Calibri" w:hAnsi="Book Antiqua" w:cs="Times New Roman"/>
-          <w:b/>
-          <w:bCs/>
-          <w:kern w:val="0"/>
-          <w:sz w:val="20"/>
-          <w:szCs w:val="20"/>
-          <w:lang w:eastAsia="zh-CN"/>
-          <w14:ligatures w14:val="none"/>
-        </w:rPr>
-      </w:pPr>
-      <w:r>
-        <w:rPr>
-          <w:rFonts w:ascii="Book Antiqua" w:eastAsia="Calibri" w:hAnsi="Book Antiqua" w:cs="Times New Roman"/>
-          <w:b/>
-          <w:bCs/>
-          <w:kern w:val="0"/>
-          <w:sz w:val="20"/>
-          <w:szCs w:val="20"/>
-          <w:lang w:eastAsia="zh-CN"/>
-          <w14:ligatures w14:val="none"/>
-        </w:rPr>
-        <w:t xml:space="preserve">PT Improvements: </w:t>
-      </w:r>
-    </w:p>
-    <w:p>
-      <w:pPr>
-        <w:spacing w:after="0" w:line="240" w:lineRule="auto"/>
-        <w:rPr>
-          <w:rFonts w:ascii="Book Antiqua" w:eastAsia="Calibri" w:hAnsi="Book Antiqua" w:cs="Times New Roman"/>
-          <w:kern w:val="0"/>
-          <w:sz w:val="20"/>
-          <w:szCs w:val="20"/>
-          <w:lang w:eastAsia="zh-CN"/>
-          <w14:ligatures w14:val="none"/>
-        </w:rPr>
-      </w:pPr>
-    </w:p>
-    <w:p>
-      <w:pPr>
-        <w:spacing w:after="0" w:line="240" w:lineRule="auto"/>
-        <w:rPr>
-          <w:rFonts w:ascii="Book Antiqua" w:eastAsia="Calibri" w:hAnsi="Book Antiqua" w:cs="Times New Roman"/>
-          <w:b/>
-          <w:bCs/>
-          <w:kern w:val="0"/>
-          <w:sz w:val="20"/>
-          <w:szCs w:val="20"/>
-          <w:lang w:eastAsia="zh-CN"/>
-          <w14:ligatures w14:val="none"/>
-        </w:rPr>
-      </w:pPr>
-      <w:r>
-        <w:rPr>
-          <w:rFonts w:ascii="Book Antiqua" w:eastAsia="Calibri" w:hAnsi="Book Antiqua" w:cs="Times New Roman"/>
-          <w:b/>
-          <w:bCs/>
-          <w:kern w:val="0"/>
-          <w:sz w:val="20"/>
-          <w:szCs w:val="20"/>
-          <w:lang w:eastAsia="zh-CN"/>
-          <w14:ligatures w14:val="none"/>
-        </w:rPr>
-        <w:t xml:space="preserve">PT Impairments: </w:t>
-      </w:r>
-    </w:p>
-    <w:p>
-      <w:pPr>
-        <w:spacing w:after="0" w:line="240" w:lineRule="auto"/>
-        <w:rPr>
-          <w:rFonts w:ascii="Book Antiqua" w:eastAsia="Calibri" w:hAnsi="Book Antiqua" w:cs="Times New Roman"/>
-          <w:kern w:val="0"/>
-          <w:sz w:val="20"/>
-          <w:szCs w:val="20"/>
-          <w:lang w:eastAsia="zh-CN"/>
-          <w14:ligatures w14:val="none"/>
-        </w:rPr>
-      </w:pPr>
-    </w:p>
-    <w:p>
-      <w:pPr>
-        <w:pStyle w:val="paragraph"/>
-        <w:spacing w:before="0" w:beforeAutospacing="0" w:after="160" w:afterAutospacing="0"/>
-        <w:textAlignment w:val="baseline"/>
-        <w:rPr>
-          <w:rStyle w:val="normaltextrun"/>
-          <w:rFonts w:ascii="Book Antiqua" w:eastAsiaTheme="majorEastAsia" w:hAnsi="Book Antiqua"/>
-          <w:sz w:val="20"/>
-          <w:szCs w:val="20"/>
-        </w:rPr>
-      </w:pPr>
-      <w:r>
-        <w:rPr>
-          <w:rFonts w:ascii="Book Antiqua" w:eastAsia="Calibri" w:hAnsi="Book Antiqua"/>
-          <w:b/>
-          <w:bCs/>
-          <w:sz w:val="20"/>
-          <w:szCs w:val="20"/>
-          <w:lang w:eastAsia="zh-CN"/>
-        </w:rPr>
-        <w:t xml:space="preserve">PT </w:t>
-      </w:r>
-      <w:proofErr w:type="gramStart"/>
-      <w:r>
-        <w:rPr>
-          <w:rFonts w:ascii="Book Antiqua" w:eastAsia="Calibri" w:hAnsi="Book Antiqua"/>
-          <w:b/>
-          <w:bCs/>
-          <w:sz w:val="20"/>
-          <w:szCs w:val="20"/>
-          <w:lang w:eastAsia="zh-CN"/>
-        </w:rPr>
-        <w:t xml:space="preserve">Recommendations:</w:t>
-      </w:r>
-      <w:r>
-        <w:rPr>
-          <w:rFonts w:ascii="Book Antiqua" w:eastAsia="Calibri" w:hAnsi="Book Antiqua"/>
-          <w:sz w:val="20"/>
-          <w:szCs w:val="20"/>
-          <w:lang w:eastAsia="zh-CN"/>
-        </w:rPr>
-        <w:t xml:space="preserve"> Jane</w:t>
-      </w:r>
-      <w:r>
-        <w:rPr>
-          <w:rStyle w:val="normaltextrun"/>
-          <w:rFonts w:ascii="Book Antiqua" w:eastAsiaTheme="majorEastAsia" w:hAnsi="Book Antiqua"/>
-          <w:sz w:val="20"/>
-          <w:szCs w:val="20"/>
-        </w:rPr>
-        <w:t xml:space="preserve"> would benefit from participation in ongoing physical therapy with focus on the following:</w:t>
-      </w:r>
-    </w:p>
-    <w:p>
-      <w:pPr>
-        <w:spacing w:after="0" w:line="240" w:lineRule="auto"/>
-        <w:rPr>
-          <w:rFonts w:ascii="Times New Roman" w:eastAsia="Calibri" w:hAnsi="Times New Roman" w:cs="Times New Roman"/>
-          <w:kern w:val="0"/>
-          <w:szCs w:val="20"/>
-          <w:lang w:eastAsia="zh-CN"/>
-          <w14:ligatures w14:val="none"/>
-        </w:rPr>
-      </w:pPr>
     </w:p>
     <w:p>
       <w:pPr>

</xml_diff>